<commit_message>
feat(st): terapkan standar tata naskah dinas untuk margin dan jarak kop surat
- Sesuaikan margin kertas A4 ke standar TND resmi (kiri 3.0cm, kanan 2.0cm, atas 2.0cm, bawah 2.5cm)
- Terapkan jarak standar 2 spasi dari garis pemisah kop ke judul SURAT TUGAS
- Sesuaikan logo Kementerian Kehutanan ke ukuran proporsional 2.4cm x 2.4cm pada margin kiri
- Terapkan font Figtree tebal pada kop surat 3 baris tanpa pembungkusan kata (no wrap)
- Rentang garis pemisah ganda kop membentang 16.0cm dari margin kiri ke margin kanan
- Sinkronisasi Live Preview pada st-naskah-editor dan output DOCX generator
</commit_message>
<xml_diff>
--- a/apps/api/assets/template-spt.docx
+++ b/apps/api/assets/template-spt.docx
@@ -4,7 +4,6 @@
   <w:body>
     <w:p>
       <w:pPr>
-        <w:ind w:left="2268" w:right="-188" w:firstLine="851"/>
         <w:rPr>
           <w:rFonts w:ascii="Cambria" w:hAnsi="Cambria"/>
           <w:b/>
@@ -12,26 +11,29 @@
           <w:szCs w:val="28"/>
           <w:lang w:val="nb-NO"/>
         </w:rPr>
+        <w:ind w:left="1450"/>
+        <w:jc w:val="center"/>
+        <w:spacing w:before="0" w:after="40" w:line="240" w:lineRule="auto"/>
       </w:pPr>
       <w:bookmarkStart w:id="0" w:name="_Hlk190075773"/>
       <w:r>
         <w:rPr>
-          <w:rFonts w:ascii="Cambria" w:hAnsi="Cambria"/>
+          <w:rFonts w:ascii="Figtree" w:hAnsi="Figtree" w:cs="Figtree"/>
           <w:b/>
           <w:noProof/>
-          <w:sz w:val="28"/>
-          <w:szCs w:val="28"/>
+          <w:sz w:val="27"/>
+          <w:szCs w:val="27"/>
         </w:rPr>
         <w:drawing>
           <wp:anchor distT="0" distB="0" distL="0" distR="0" simplePos="0" relativeHeight="251660288" behindDoc="0" locked="0" layoutInCell="1" allowOverlap="1" wp14:anchorId="71CE5EA2" wp14:editId="039405B2">
             <wp:simplePos x="0" y="0"/>
-            <wp:positionH relativeFrom="page">
-              <wp:posOffset>717550</wp:posOffset>
+            <wp:positionH relativeFrom="margin">
+              <wp:posOffset>0</wp:posOffset>
             </wp:positionH>
             <wp:positionV relativeFrom="paragraph">
-              <wp:posOffset>-163195</wp:posOffset>
+              <wp:posOffset>0</wp:posOffset>
             </wp:positionV>
-            <wp:extent cx="1009650" cy="1009650"/>
+            <wp:extent cx="864000" cy="864000"/>
             <wp:effectExtent l="0" t="0" r="0" b="0"/>
             <wp:wrapNone/>
             <wp:docPr id="4" name="Image 4"/>
@@ -54,7 +56,7 @@
                   <pic:spPr>
                     <a:xfrm>
                       <a:off x="0" y="0"/>
-                      <a:ext cx="1009650" cy="1009650"/>
+                      <a:ext cx="864000" cy="864000"/>
                     </a:xfrm>
                     <a:prstGeom prst="rect">
                       <a:avLst/>
@@ -68,223 +70,226 @@
       </w:r>
       <w:r>
         <w:rPr>
+          <w:rFonts w:ascii="Figtree" w:hAnsi="Figtree" w:cs="Figtree"/>
+          <w:b/>
+          <w:sz w:val="27"/>
+          <w:szCs w:val="27"/>
+          <w:lang w:val="nb-NO"/>
+        </w:rPr>
+        <w:t xml:space="preserve">KEMENTERIAN KEHUTANAN </w:t>
+      </w:r>
+    </w:p>
+    <w:p>
+      <w:pPr>
+        <w:rPr>
           <w:rFonts w:ascii="Cambria" w:hAnsi="Cambria"/>
           <w:b/>
           <w:sz w:val="28"/>
           <w:szCs w:val="28"/>
           <w:lang w:val="nb-NO"/>
         </w:rPr>
-        <w:t xml:space="preserve">KEMENTERIAN KEHUTANAN </w:t>
+        <w:ind w:left="1450"/>
+        <w:jc w:val="center"/>
+        <w:spacing w:before="0" w:after="40" w:line="240" w:lineRule="auto"/>
+      </w:pPr>
+      <w:r>
+        <w:rPr>
+          <w:rFonts w:ascii="Figtree" w:hAnsi="Figtree" w:cs="Figtree"/>
+          <w:b/>
+          <w:sz w:val="25"/>
+          <w:szCs w:val="25"/>
+          <w:lang w:val="nb-NO"/>
+        </w:rPr>
+        <w:t xml:space="preserve">  </w:t>
+      </w:r>
+      <w:r>
+        <w:rPr>
+          <w:rFonts w:ascii="Figtree" w:hAnsi="Figtree" w:cs="Figtree"/>
+          <w:b/>
+          <w:sz w:val="25"/>
+          <w:szCs w:val="25"/>
+          <w:lang w:val="nb-NO"/>
+        </w:rPr>
+        <w:t>DIREKTORAT</w:t>
+      </w:r>
+      <w:r>
+        <w:rPr>
+          <w:rFonts w:ascii="Figtree" w:hAnsi="Figtree" w:cs="Figtree"/>
+          <w:b/>
+          <w:spacing w:val="-13"/>
+          <w:sz w:val="25"/>
+          <w:szCs w:val="25"/>
+          <w:lang w:val="nb-NO"/>
+        </w:rPr>
+        <w:t xml:space="preserve"> </w:t>
+      </w:r>
+      <w:r>
+        <w:rPr>
+          <w:rFonts w:ascii="Figtree" w:hAnsi="Figtree" w:cs="Figtree"/>
+          <w:b/>
+          <w:sz w:val="25"/>
+          <w:szCs w:val="25"/>
+          <w:lang w:val="nb-NO"/>
+        </w:rPr>
+        <w:t>JENDERAL</w:t>
+      </w:r>
+      <w:r>
+        <w:rPr>
+          <w:rFonts w:ascii="Figtree" w:hAnsi="Figtree" w:cs="Figtree"/>
+          <w:b/>
+          <w:spacing w:val="-13"/>
+          <w:sz w:val="25"/>
+          <w:szCs w:val="25"/>
+          <w:lang w:val="nb-NO"/>
+        </w:rPr>
+        <w:t xml:space="preserve"> </w:t>
+      </w:r>
+      <w:r>
+        <w:rPr>
+          <w:rFonts w:ascii="Figtree" w:hAnsi="Figtree" w:cs="Figtree"/>
+          <w:b/>
+          <w:sz w:val="25"/>
+          <w:szCs w:val="25"/>
+          <w:lang w:val="nb-NO"/>
+        </w:rPr>
+        <w:t>PERHUTANAN</w:t>
+      </w:r>
+      <w:r>
+        <w:rPr>
+          <w:rFonts w:ascii="Figtree" w:hAnsi="Figtree" w:cs="Figtree"/>
+          <w:b/>
+          <w:spacing w:val="-13"/>
+          <w:sz w:val="25"/>
+          <w:szCs w:val="25"/>
+          <w:lang w:val="nb-NO"/>
+        </w:rPr>
+        <w:t xml:space="preserve"> </w:t>
+      </w:r>
+      <w:r>
+        <w:rPr>
+          <w:rFonts w:ascii="Figtree" w:hAnsi="Figtree" w:cs="Figtree"/>
+          <w:b/>
+          <w:sz w:val="25"/>
+          <w:szCs w:val="25"/>
+          <w:lang w:val="nb-NO"/>
+        </w:rPr>
+        <w:t>SOSIAL</w:t>
       </w:r>
     </w:p>
     <w:p>
       <w:pPr>
-        <w:ind w:left="2268" w:right="-188" w:hanging="283"/>
-        <w:rPr>
-          <w:rFonts w:ascii="Cambria" w:hAnsi="Cambria"/>
-          <w:b/>
-          <w:sz w:val="28"/>
-          <w:szCs w:val="28"/>
-          <w:lang w:val="nb-NO"/>
-        </w:rPr>
-      </w:pPr>
-      <w:r>
-        <w:rPr>
-          <w:rFonts w:ascii="Cambria" w:hAnsi="Cambria"/>
-          <w:b/>
-          <w:sz w:val="28"/>
-          <w:szCs w:val="28"/>
-          <w:lang w:val="nb-NO"/>
-        </w:rPr>
-        <w:t xml:space="preserve">  </w:t>
-      </w:r>
-      <w:r>
-        <w:rPr>
-          <w:rFonts w:ascii="Cambria" w:hAnsi="Cambria"/>
-          <w:b/>
-          <w:sz w:val="28"/>
-          <w:szCs w:val="28"/>
-          <w:lang w:val="nb-NO"/>
-        </w:rPr>
-        <w:t>DIREKTORAT</w:t>
-      </w:r>
-      <w:r>
-        <w:rPr>
-          <w:rFonts w:ascii="Cambria" w:hAnsi="Cambria"/>
-          <w:b/>
-          <w:spacing w:val="-13"/>
-          <w:sz w:val="28"/>
-          <w:szCs w:val="28"/>
-          <w:lang w:val="nb-NO"/>
-        </w:rPr>
-        <w:t xml:space="preserve"> </w:t>
-      </w:r>
-      <w:r>
-        <w:rPr>
-          <w:rFonts w:ascii="Cambria" w:hAnsi="Cambria"/>
-          <w:b/>
-          <w:sz w:val="28"/>
-          <w:szCs w:val="28"/>
-          <w:lang w:val="nb-NO"/>
-        </w:rPr>
-        <w:t>JENDERAL</w:t>
-      </w:r>
-      <w:r>
-        <w:rPr>
-          <w:rFonts w:ascii="Cambria" w:hAnsi="Cambria"/>
-          <w:b/>
-          <w:spacing w:val="-13"/>
-          <w:sz w:val="28"/>
-          <w:szCs w:val="28"/>
-          <w:lang w:val="nb-NO"/>
-        </w:rPr>
-        <w:t xml:space="preserve"> </w:t>
-      </w:r>
-      <w:r>
-        <w:rPr>
-          <w:rFonts w:ascii="Cambria" w:hAnsi="Cambria"/>
-          <w:b/>
-          <w:sz w:val="28"/>
-          <w:szCs w:val="28"/>
-          <w:lang w:val="nb-NO"/>
-        </w:rPr>
-        <w:t>PERHUTANAN</w:t>
-      </w:r>
-      <w:r>
-        <w:rPr>
-          <w:rFonts w:ascii="Cambria" w:hAnsi="Cambria"/>
-          <w:b/>
-          <w:spacing w:val="-13"/>
-          <w:sz w:val="28"/>
-          <w:szCs w:val="28"/>
-          <w:lang w:val="nb-NO"/>
-        </w:rPr>
-        <w:t xml:space="preserve"> </w:t>
-      </w:r>
-      <w:r>
-        <w:rPr>
-          <w:rFonts w:ascii="Cambria" w:hAnsi="Cambria"/>
-          <w:b/>
-          <w:sz w:val="28"/>
-          <w:szCs w:val="28"/>
-          <w:lang w:val="nb-NO"/>
-        </w:rPr>
-        <w:t>SOSIAL</w:t>
-      </w:r>
-    </w:p>
-    <w:p>
-      <w:pPr>
         <w:pStyle w:val="Heading1"/>
-        <w:ind w:right="-188" w:firstLine="1247"/>
         <w:rPr>
           <w:rFonts w:ascii="Cambria" w:hAnsi="Cambria"/>
           <w:b/>
           <w:bCs/>
-          <w:spacing w:val="-2"/>
+          <w:spacing w:val="-2" w:before="0" w:after="120" w:line="240" w:lineRule="auto"/>
           <w:sz w:val="32"/>
           <w:szCs w:val="32"/>
           <w:lang w:val="nb-NO"/>
         </w:rPr>
-      </w:pPr>
-      <w:r>
-        <w:rPr>
-          <w:rFonts w:ascii="Cambria" w:hAnsi="Cambria"/>
+        <w:ind w:left="1450"/>
+        <w:jc w:val="center"/>
+      </w:pPr>
+      <w:r>
+        <w:rPr>
+          <w:rFonts w:ascii="Figtree" w:hAnsi="Figtree" w:cs="Figtree"/>
           <w:b/>
           <w:bCs/>
-          <w:sz w:val="32"/>
-          <w:szCs w:val="32"/>
+          <w:sz w:val="25"/>
+          <w:szCs w:val="25"/>
           <w:lang w:val="nb-NO"/>
         </w:rPr>
         <w:t xml:space="preserve"> </w:t>
       </w:r>
       <w:r>
         <w:rPr>
-          <w:rFonts w:ascii="Cambria" w:hAnsi="Cambria"/>
+          <w:rFonts w:ascii="Figtree" w:hAnsi="Figtree" w:cs="Figtree"/>
           <w:b/>
           <w:bCs/>
-          <w:sz w:val="32"/>
-          <w:szCs w:val="32"/>
+          <w:sz w:val="25"/>
+          <w:szCs w:val="25"/>
           <w:lang w:val="nb-NO"/>
         </w:rPr>
         <w:t xml:space="preserve"> </w:t>
       </w:r>
       <w:r>
         <w:rPr>
-          <w:rFonts w:ascii="Cambria" w:hAnsi="Cambria"/>
+          <w:rFonts w:ascii="Figtree" w:hAnsi="Figtree" w:cs="Figtree"/>
           <w:b/>
           <w:bCs/>
-          <w:sz w:val="32"/>
-          <w:szCs w:val="32"/>
+          <w:sz w:val="25"/>
+          <w:szCs w:val="25"/>
           <w:lang w:val="nb-NO"/>
         </w:rPr>
         <w:t>DIREKTORAT</w:t>
       </w:r>
       <w:r>
         <w:rPr>
-          <w:rFonts w:ascii="Cambria" w:hAnsi="Cambria"/>
+          <w:rFonts w:ascii="Figtree" w:hAnsi="Figtree" w:cs="Figtree"/>
           <w:b/>
           <w:bCs/>
           <w:spacing w:val="-10"/>
-          <w:sz w:val="32"/>
-          <w:szCs w:val="32"/>
+          <w:sz w:val="25"/>
+          <w:szCs w:val="25"/>
           <w:lang w:val="nb-NO"/>
         </w:rPr>
         <w:t xml:space="preserve"> </w:t>
       </w:r>
       <w:r>
         <w:rPr>
-          <w:rFonts w:ascii="Cambria" w:hAnsi="Cambria"/>
+          <w:rFonts w:ascii="Figtree" w:hAnsi="Figtree" w:cs="Figtree"/>
           <w:b/>
           <w:bCs/>
-          <w:sz w:val="32"/>
-          <w:szCs w:val="32"/>
+          <w:sz w:val="25"/>
+          <w:szCs w:val="25"/>
           <w:lang w:val="nb-NO"/>
         </w:rPr>
         <w:t>PENGENDALIAN</w:t>
       </w:r>
       <w:r>
         <w:rPr>
-          <w:rFonts w:ascii="Cambria" w:hAnsi="Cambria"/>
+          <w:rFonts w:ascii="Figtree" w:hAnsi="Figtree" w:cs="Figtree"/>
           <w:b/>
           <w:bCs/>
           <w:spacing w:val="-8"/>
-          <w:sz w:val="32"/>
-          <w:szCs w:val="32"/>
+          <w:sz w:val="25"/>
+          <w:szCs w:val="25"/>
           <w:lang w:val="nb-NO"/>
         </w:rPr>
         <w:t xml:space="preserve"> </w:t>
       </w:r>
       <w:r>
         <w:rPr>
-          <w:rFonts w:ascii="Cambria" w:hAnsi="Cambria"/>
+          <w:rFonts w:ascii="Figtree" w:hAnsi="Figtree" w:cs="Figtree"/>
           <w:b/>
           <w:bCs/>
-          <w:sz w:val="32"/>
-          <w:szCs w:val="32"/>
+          <w:sz w:val="25"/>
+          <w:szCs w:val="25"/>
           <w:lang w:val="nb-NO"/>
         </w:rPr>
         <w:t>PERHUTANAN</w:t>
       </w:r>
       <w:r>
         <w:rPr>
-          <w:rFonts w:ascii="Cambria" w:hAnsi="Cambria"/>
+          <w:rFonts w:ascii="Figtree" w:hAnsi="Figtree" w:cs="Figtree"/>
           <w:b/>
           <w:bCs/>
           <w:spacing w:val="-7"/>
-          <w:sz w:val="32"/>
-          <w:szCs w:val="32"/>
+          <w:sz w:val="25"/>
+          <w:szCs w:val="25"/>
           <w:lang w:val="nb-NO"/>
         </w:rPr>
         <w:t xml:space="preserve"> </w:t>
       </w:r>
       <w:r>
         <w:rPr>
-          <w:rFonts w:ascii="Cambria" w:hAnsi="Cambria"/>
+          <w:rFonts w:ascii="Figtree" w:hAnsi="Figtree" w:cs="Figtree"/>
           <w:b/>
           <w:bCs/>
           <w:spacing w:val="-2"/>
-          <w:sz w:val="32"/>
-          <w:szCs w:val="32"/>
+          <w:sz w:val="25"/>
+          <w:szCs w:val="25"/>
           <w:lang w:val="nb-NO"/>
         </w:rPr>
         <w:t>SOSIAL</w:t>
@@ -316,13 +321,13 @@
             <w:drawing>
               <wp:anchor distT="0" distB="0" distL="0" distR="0" simplePos="0" relativeHeight="251659264" behindDoc="0" locked="0" layoutInCell="1" allowOverlap="1" wp14:anchorId="33EC01D8" wp14:editId="0FC2FB41">
                 <wp:simplePos x="0" y="0"/>
-                <wp:positionH relativeFrom="page">
-                  <wp:posOffset>356235</wp:posOffset>
+                <wp:positionH relativeFrom="margin">
+                  <wp:posOffset>0</wp:posOffset>
                 </wp:positionH>
-                <wp:positionV relativeFrom="page">
-                  <wp:posOffset>1335405</wp:posOffset>
+                <wp:positionV relativeFrom="paragraph">
+                  <wp:posOffset>60000</wp:posOffset>
                 </wp:positionV>
-                <wp:extent cx="7127875" cy="57150"/>
+                <wp:extent cx="5760000" cy="57150"/>
                 <wp:effectExtent l="0" t="0" r="0" b="0"/>
                 <wp:wrapNone/>
                 <wp:docPr id="3" name="Graphic 3"/>
@@ -338,7 +343,7 @@
                       <wps:spPr>
                         <a:xfrm>
                           <a:off x="0" y="0"/>
-                          <a:ext cx="7127875" cy="57150"/>
+                          <a:ext cx="5760000" cy="57150"/>
                         </a:xfrm>
                         <a:custGeom>
                           <a:avLst/>
@@ -347,9 +352,9 @@
                           <a:cxnLst/>
                           <a:rect l="l" t="t" r="r" b="b"/>
                           <a:pathLst>
-                            <a:path w="7127875" h="57150">
+                            <a:path w="5760000" h="57150">
                               <a:moveTo>
-                                <a:pt x="7127875" y="45720"/>
+                                <a:pt x="5760000" y="45720"/>
                               </a:moveTo>
                               <a:lnTo>
                                 <a:pt x="0" y="45720"/>
@@ -358,16 +363,16 @@
                                 <a:pt x="0" y="57150"/>
                               </a:lnTo>
                               <a:lnTo>
-                                <a:pt x="7127875" y="57150"/>
+                                <a:pt x="5760000" y="57150"/>
                               </a:lnTo>
                               <a:lnTo>
-                                <a:pt x="7127875" y="45720"/>
+                                <a:pt x="5760000" y="45720"/>
                               </a:lnTo>
                               <a:close/>
                             </a:path>
-                            <a:path w="7127875" h="57150">
+                            <a:path w="5760000" h="57150">
                               <a:moveTo>
-                                <a:pt x="7127875" y="0"/>
+                                <a:pt x="5760000" y="0"/>
                               </a:moveTo>
                               <a:lnTo>
                                 <a:pt x="0" y="0"/>
@@ -376,10 +381,10 @@
                                 <a:pt x="0" y="34290"/>
                               </a:lnTo>
                               <a:lnTo>
-                                <a:pt x="7127875" y="34290"/>
+                                <a:pt x="5760000" y="34290"/>
                               </a:lnTo>
                               <a:lnTo>
-                                <a:pt x="7127875" y="0"/>
+                                <a:pt x="5760000" y="0"/>
                               </a:lnTo>
                               <a:close/>
                             </a:path>
@@ -453,6 +458,7 @@
           <w:szCs w:val="22"/>
           <w:lang w:val="id-ID"/>
         </w:rPr>
+        <w:spacing w:before="280" w:after="60"/>
       </w:pPr>
       <w:r>
         <w:rPr>
@@ -700,8 +706,8 @@
     <w:tbl>
       <w:tblPr>
         <w:tblStyle w:val="TableGrid"/>
-        <w:tblW w:w="9967" w:type="dxa"/>
-        <w:tblInd w:w="-540" w:type="dxa"/>
+        <w:tblW w:w="9071" w:type="dxa"/>
+        <w:tblInd w:w="0" w:type="dxa"/>
         <w:tblBorders>
           <w:top w:val="none" w:sz="0" w:space="0" w:color="auto"/>
           <w:left w:val="none" w:sz="0" w:space="0" w:color="auto"/>
@@ -713,8 +719,8 @@
         <w:tblLook w:val="04A0" w:firstRow="1" w:lastRow="0" w:firstColumn="1" w:lastColumn="0" w:noHBand="0" w:noVBand="1"/>
       </w:tblPr>
       <w:tblGrid>
-        <w:gridCol w:w="1816"/>
-        <w:gridCol w:w="8151"/>
+        <w:gridCol w:w="1700"/>
+        <w:gridCol w:w="7371"/>
       </w:tblGrid>
       <w:tr>
         <w:trPr>
@@ -906,14 +912,14 @@
     </w:tbl>
     <w:tbl>
       <w:tblPr>
-        <w:tblW w:w="9859" w:type="dxa"/>
-        <w:tblInd w:w="-540" w:type="dxa"/>
+        <w:tblW w:w="9071" w:type="dxa"/>
+        <w:tblInd w:w="0" w:type="dxa"/>
         <w:tblLook w:val="04A0" w:firstRow="1" w:lastRow="0" w:firstColumn="1" w:lastColumn="0" w:noHBand="0" w:noVBand="1"/>
       </w:tblPr>
       <w:tblGrid>
-        <w:gridCol w:w="1816"/>
-        <w:gridCol w:w="5781"/>
-        <w:gridCol w:w="2262"/>
+        <w:gridCol w:w="1700"/>
+        <w:gridCol w:w="5371"/>
+        <w:gridCol w:w="2000"/>
       </w:tblGrid>
       <w:tr>
         <w:trPr>
@@ -2832,7 +2838,7 @@
     </w:p>
     <w:sectPr>
       <w:pgSz w:w="11906" w:h="16838"/>
-      <w:pgMar w:top="567" w:right="1440" w:bottom="360" w:left="1440" w:header="706" w:footer="706" w:gutter="0"/>
+      <w:pgMar w:top="1134" w:right="1134" w:bottom="1418" w:left="1701" w:header="706" w:footer="706" w:gutter="0"/>
       <w:cols w:space="708"/>
       <w:docGrid w:linePitch="360"/>
     </w:sectPr>

</xml_diff>

<commit_message>
fix(docx): sesuaikan margin simetris kop kementerian dan hilangkan indentasi kop miring
</commit_message>
<xml_diff>
--- a/apps/api/assets/template-spt.docx
+++ b/apps/api/assets/template-spt.docx
@@ -11,9 +11,8 @@
           <w:szCs w:val="28"/>
           <w:lang w:val="nb-NO"/>
         </w:rPr>
-        <w:ind w:left="1450"/>
         <w:jc w:val="center"/>
-        <w:spacing w:before="0" w:after="40" w:line="240" w:lineRule="auto"/>
+        <w:spacing w:before="0" w:after="30" w:line="240" w:lineRule="auto"/>
       </w:pPr>
       <w:bookmarkStart w:id="0" w:name="_Hlk190075773"/>
       <w:r>
@@ -88,9 +87,8 @@
           <w:szCs w:val="28"/>
           <w:lang w:val="nb-NO"/>
         </w:rPr>
-        <w:ind w:left="1450"/>
         <w:jc w:val="center"/>
-        <w:spacing w:before="0" w:after="40" w:line="240" w:lineRule="auto"/>
+        <w:spacing w:before="0" w:after="30" w:line="240" w:lineRule="auto"/>
       </w:pPr>
       <w:r>
         <w:rPr>
@@ -183,12 +181,11 @@
           <w:rFonts w:ascii="Cambria" w:hAnsi="Cambria"/>
           <w:b/>
           <w:bCs/>
-          <w:spacing w:val="-2" w:before="0" w:after="120" w:line="240" w:lineRule="auto"/>
+          <w:spacing w:val="-2" w:before="0" w:after="100" w:line="240" w:lineRule="auto"/>
           <w:sz w:val="32"/>
           <w:szCs w:val="32"/>
           <w:lang w:val="nb-NO"/>
         </w:rPr>
-        <w:ind w:left="1450"/>
         <w:jc w:val="center"/>
       </w:pPr>
       <w:r>
@@ -325,9 +322,9 @@
                   <wp:posOffset>0</wp:posOffset>
                 </wp:positionH>
                 <wp:positionV relativeFrom="paragraph">
-                  <wp:posOffset>60000</wp:posOffset>
+                  <wp:posOffset>50000</wp:posOffset>
                 </wp:positionV>
-                <wp:extent cx="5760000" cy="57150"/>
+                <wp:extent cx="6120000" cy="57150"/>
                 <wp:effectExtent l="0" t="0" r="0" b="0"/>
                 <wp:wrapNone/>
                 <wp:docPr id="3" name="Graphic 3"/>
@@ -343,7 +340,7 @@
                       <wps:spPr>
                         <a:xfrm>
                           <a:off x="0" y="0"/>
-                          <a:ext cx="5760000" cy="57150"/>
+                          <a:ext cx="6120000" cy="57150"/>
                         </a:xfrm>
                         <a:custGeom>
                           <a:avLst/>
@@ -352,9 +349,9 @@
                           <a:cxnLst/>
                           <a:rect l="l" t="t" r="r" b="b"/>
                           <a:pathLst>
-                            <a:path w="5760000" h="57150">
+                            <a:path w="6120000" h="57150">
                               <a:moveTo>
-                                <a:pt x="5760000" y="45720"/>
+                                <a:pt x="6120000" y="45720"/>
                               </a:moveTo>
                               <a:lnTo>
                                 <a:pt x="0" y="45720"/>
@@ -363,16 +360,16 @@
                                 <a:pt x="0" y="57150"/>
                               </a:lnTo>
                               <a:lnTo>
-                                <a:pt x="5760000" y="57150"/>
+                                <a:pt x="6120000" y="57150"/>
                               </a:lnTo>
                               <a:lnTo>
-                                <a:pt x="5760000" y="45720"/>
+                                <a:pt x="6120000" y="45720"/>
                               </a:lnTo>
                               <a:close/>
                             </a:path>
-                            <a:path w="5760000" h="57150">
+                            <a:path w="6120000" h="57150">
                               <a:moveTo>
-                                <a:pt x="5760000" y="0"/>
+                                <a:pt x="6120000" y="0"/>
                               </a:moveTo>
                               <a:lnTo>
                                 <a:pt x="0" y="0"/>
@@ -381,10 +378,10 @@
                                 <a:pt x="0" y="34290"/>
                               </a:lnTo>
                               <a:lnTo>
-                                <a:pt x="5760000" y="34290"/>
+                                <a:pt x="6120000" y="34290"/>
                               </a:lnTo>
                               <a:lnTo>
-                                <a:pt x="5760000" y="0"/>
+                                <a:pt x="6120000" y="0"/>
                               </a:lnTo>
                               <a:close/>
                             </a:path>
@@ -458,7 +455,7 @@
           <w:szCs w:val="22"/>
           <w:lang w:val="id-ID"/>
         </w:rPr>
-        <w:spacing w:before="280" w:after="60"/>
+        <w:spacing w:before="240" w:after="60"/>
       </w:pPr>
       <w:r>
         <w:rPr>
@@ -706,7 +703,7 @@
     <w:tbl>
       <w:tblPr>
         <w:tblStyle w:val="TableGrid"/>
-        <w:tblW w:w="9071" w:type="dxa"/>
+        <w:tblW w:w="9638" w:type="dxa"/>
         <w:tblInd w:w="0" w:type="dxa"/>
         <w:tblBorders>
           <w:top w:val="none" w:sz="0" w:space="0" w:color="auto"/>
@@ -720,7 +717,7 @@
       </w:tblPr>
       <w:tblGrid>
         <w:gridCol w:w="1700"/>
-        <w:gridCol w:w="7371"/>
+        <w:gridCol w:w="7938"/>
       </w:tblGrid>
       <w:tr>
         <w:trPr>
@@ -912,13 +909,13 @@
     </w:tbl>
     <w:tbl>
       <w:tblPr>
-        <w:tblW w:w="9071" w:type="dxa"/>
+        <w:tblW w:w="9638" w:type="dxa"/>
         <w:tblInd w:w="0" w:type="dxa"/>
         <w:tblLook w:val="04A0" w:firstRow="1" w:lastRow="0" w:firstColumn="1" w:lastColumn="0" w:noHBand="0" w:noVBand="1"/>
       </w:tblPr>
       <w:tblGrid>
         <w:gridCol w:w="1700"/>
-        <w:gridCol w:w="5371"/>
+        <w:gridCol w:w="5938"/>
         <w:gridCol w:w="2000"/>
       </w:tblGrid>
       <w:tr>
@@ -2838,7 +2835,7 @@
     </w:p>
     <w:sectPr>
       <w:pgSz w:w="11906" w:h="16838"/>
-      <w:pgMar w:top="1134" w:right="1134" w:bottom="1418" w:left="1701" w:header="706" w:footer="706" w:gutter="0"/>
+      <w:pgMar w:top="850" w:right="1134" w:bottom="1418" w:left="1134" w:header="706" w:footer="706" w:gutter="0"/>
       <w:cols w:space="708"/>
       <w:docGrid w:linePitch="360"/>
     </w:sectPr>

</xml_diff>

<commit_message>
fix(st): sesuaikan margin dan kop naskah dinas persis standar resmi ST.265 dan CONTOH SPT
</commit_message>
<xml_diff>
--- a/apps/api/assets/template-spt.docx
+++ b/apps/api/assets/template-spt.docx
@@ -1,9 +1,10 @@
 
 <file path=word/document.xml><?xml version="1.0" encoding="utf-8"?>
-<w:document xmlns:wpc="http://schemas.microsoft.com/office/word/2010/wordprocessingCanvas" xmlns:cx="http://schemas.microsoft.com/office/drawing/2014/chartex" xmlns:cx1="http://schemas.microsoft.com/office/drawing/2015/9/8/chartex" xmlns:cx2="http://schemas.microsoft.com/office/drawing/2015/10/21/chartex" xmlns:cx3="http://schemas.microsoft.com/office/drawing/2016/5/9/chartex" xmlns:cx4="http://schemas.microsoft.com/office/drawing/2016/5/10/chartex" xmlns:cx5="http://schemas.microsoft.com/office/drawing/2016/5/11/chartex" xmlns:cx6="http://schemas.microsoft.com/office/drawing/2016/5/12/chartex" xmlns:cx7="http://schemas.microsoft.com/office/drawing/2016/5/13/chartex" xmlns:cx8="http://schemas.microsoft.com/office/drawing/2016/5/14/chartex" xmlns:mc="http://schemas.openxmlformats.org/markup-compatibility/2006" xmlns:aink="http://schemas.microsoft.com/office/drawing/2016/ink" xmlns:am3d="http://schemas.microsoft.com/office/drawing/2017/model3d" xmlns:o="urn:schemas-microsoft-com:office:office" xmlns:oel="http://schemas.microsoft.com/office/2019/extlst" xmlns:r="http://schemas.openxmlformats.org/officeDocument/2006/relationships" xmlns:m="http://schemas.openxmlformats.org/officeDocument/2006/math" xmlns:v="urn:schemas-microsoft-com:vml" xmlns:wp14="http://schemas.microsoft.com/office/word/2010/wordprocessingDrawing" xmlns:wp="http://schemas.openxmlformats.org/drawingml/2006/wordprocessingDrawing" xmlns:w10="urn:schemas-microsoft-com:office:word" xmlns:w="http://schemas.openxmlformats.org/wordprocessingml/2006/main" xmlns:w14="http://schemas.microsoft.com/office/word/2010/wordml" xmlns:w15="http://schemas.microsoft.com/office/word/2012/wordml" xmlns:w16cex="http://schemas.microsoft.com/office/word/2018/wordml/cex" xmlns:w16cid="http://schemas.microsoft.com/office/word/2016/wordml/cid" xmlns:w16="http://schemas.microsoft.com/office/word/2018/wordml" xmlns:w16sdtdh="http://schemas.microsoft.com/office/word/2020/wordml/sdtdatahash" xmlns:w16se="http://schemas.microsoft.com/office/word/2015/wordml/symex" xmlns:wpg="http://schemas.microsoft.com/office/word/2010/wordprocessingGroup" xmlns:wpi="http://schemas.microsoft.com/office/word/2010/wordprocessingInk" xmlns:wne="http://schemas.microsoft.com/office/word/2006/wordml" xmlns:wps="http://schemas.microsoft.com/office/word/2010/wordprocessingShape" mc:Ignorable="w14 w15 w16se w16cid w16 w16cex w16sdtdh wp14">
+<w:document xmlns:a="http://schemas.openxmlformats.org/drawingml/2006/main" xmlns:mc="http://schemas.openxmlformats.org/markup-compatibility/2006" xmlns:ns4="http://schemas.microsoft.com/office/word/2010/wordprocessingDrawing" xmlns:ns8="http://schemas.microsoft.com/office/word/2010/wordprocessingShape" xmlns:o="urn:schemas-microsoft-com:office:office" xmlns:pic="http://schemas.openxmlformats.org/drawingml/2006/picture" xmlns:r="http://schemas.openxmlformats.org/officeDocument/2006/relationships" xmlns:v="urn:schemas-microsoft-com:vml" xmlns:w="http://schemas.openxmlformats.org/wordprocessingml/2006/main" xmlns:w10="urn:schemas-microsoft-com:office:word" xmlns:w14="http://schemas.microsoft.com/office/word/2010/wordml" xmlns:wp="http://schemas.openxmlformats.org/drawingml/2006/wordprocessingDrawing" mc:Ignorable="w14 w15 w16se w16cid w16 w16cex w16sdtdh wp14">
   <w:body>
     <w:p>
       <w:pPr>
+        <w:ind w:left="2268" w:right="-188" w:firstLine="851"/>
         <w:rPr>
           <w:rFonts w:ascii="Cambria" w:hAnsi="Cambria"/>
           <w:b/>
@@ -11,37 +12,35 @@
           <w:szCs w:val="28"/>
           <w:lang w:val="nb-NO"/>
         </w:rPr>
-        <w:jc w:val="center"/>
-        <w:spacing w:before="0" w:after="30" w:line="240" w:lineRule="auto"/>
       </w:pPr>
       <w:bookmarkStart w:id="0" w:name="_Hlk190075773"/>
       <w:r>
         <w:rPr>
-          <w:rFonts w:ascii="Figtree" w:hAnsi="Figtree" w:cs="Figtree"/>
+          <w:rFonts w:ascii="Figtree" w:hAnsi="Figtree"/>
           <w:b/>
           <w:noProof/>
-          <w:sz w:val="27"/>
-          <w:szCs w:val="27"/>
+          <w:sz w:val="28"/>
+          <w:szCs w:val="28"/>
         </w:rPr>
         <w:drawing>
-          <wp:anchor distT="0" distB="0" distL="0" distR="0" simplePos="0" relativeHeight="251660288" behindDoc="0" locked="0" layoutInCell="1" allowOverlap="1" wp14:anchorId="71CE5EA2" wp14:editId="039405B2">
+          <wp:anchor distT="0" distB="0" distL="0" distR="0" simplePos="0" relativeHeight="251660288" behindDoc="0" locked="0" layoutInCell="1" allowOverlap="1" ns4:anchorId="71CE5EA2" ns4:editId="039405B2">
             <wp:simplePos x="0" y="0"/>
-            <wp:positionH relativeFrom="margin">
-              <wp:posOffset>0</wp:posOffset>
+            <wp:positionH relativeFrom="page">
+              <wp:posOffset>717550</wp:posOffset>
             </wp:positionH>
             <wp:positionV relativeFrom="paragraph">
-              <wp:posOffset>0</wp:posOffset>
+              <wp:posOffset>-163195</wp:posOffset>
             </wp:positionV>
-            <wp:extent cx="864000" cy="864000"/>
+            <wp:extent cx="1009650" cy="1009650"/>
             <wp:effectExtent l="0" t="0" r="0" b="0"/>
             <wp:wrapNone/>
             <wp:docPr id="4" name="Image 4"/>
             <wp:cNvGraphicFramePr>
-              <a:graphicFrameLocks xmlns:a="http://schemas.openxmlformats.org/drawingml/2006/main"/>
+              <a:graphicFrameLocks/>
             </wp:cNvGraphicFramePr>
-            <a:graphic xmlns:a="http://schemas.openxmlformats.org/drawingml/2006/main">
+            <a:graphic>
               <a:graphicData uri="http://schemas.openxmlformats.org/drawingml/2006/picture">
-                <pic:pic xmlns:pic="http://schemas.openxmlformats.org/drawingml/2006/picture">
+                <pic:pic>
                   <pic:nvPicPr>
                     <pic:cNvPr id="4" name="Image 4"/>
                     <pic:cNvPicPr/>
@@ -55,7 +54,7 @@
                   <pic:spPr>
                     <a:xfrm>
                       <a:off x="0" y="0"/>
-                      <a:ext cx="864000" cy="864000"/>
+                      <a:ext cx="1009650" cy="1009650"/>
                     </a:xfrm>
                     <a:prstGeom prst="rect">
                       <a:avLst/>
@@ -69,10 +68,10 @@
       </w:r>
       <w:r>
         <w:rPr>
-          <w:rFonts w:ascii="Figtree" w:hAnsi="Figtree" w:cs="Figtree"/>
+          <w:rFonts w:ascii="Figtree" w:hAnsi="Figtree"/>
           <w:b/>
-          <w:sz w:val="27"/>
-          <w:szCs w:val="27"/>
+          <w:sz w:val="28"/>
+          <w:szCs w:val="28"/>
           <w:lang w:val="nb-NO"/>
         </w:rPr>
         <w:t xml:space="preserve">KEMENTERIAN KEHUTANAN </w:t>
@@ -80,6 +79,7 @@
     </w:p>
     <w:p>
       <w:pPr>
+        <w:ind w:left="2268" w:right="-188" w:hanging="283"/>
         <w:rPr>
           <w:rFonts w:ascii="Cambria" w:hAnsi="Cambria"/>
           <w:b/>
@@ -87,88 +87,86 @@
           <w:szCs w:val="28"/>
           <w:lang w:val="nb-NO"/>
         </w:rPr>
-        <w:jc w:val="center"/>
-        <w:spacing w:before="0" w:after="30" w:line="240" w:lineRule="auto"/>
-      </w:pPr>
-      <w:r>
-        <w:rPr>
-          <w:rFonts w:ascii="Figtree" w:hAnsi="Figtree" w:cs="Figtree"/>
+      </w:pPr>
+      <w:r>
+        <w:rPr>
+          <w:rFonts w:ascii="Figtree" w:hAnsi="Figtree"/>
           <w:b/>
-          <w:sz w:val="25"/>
-          <w:szCs w:val="25"/>
+          <w:sz w:val="28"/>
+          <w:szCs w:val="28"/>
           <w:lang w:val="nb-NO"/>
         </w:rPr>
         <w:t xml:space="preserve">  </w:t>
       </w:r>
       <w:r>
         <w:rPr>
-          <w:rFonts w:ascii="Figtree" w:hAnsi="Figtree" w:cs="Figtree"/>
+          <w:rFonts w:ascii="Figtree" w:hAnsi="Figtree"/>
           <w:b/>
-          <w:sz w:val="25"/>
-          <w:szCs w:val="25"/>
+          <w:sz w:val="28"/>
+          <w:szCs w:val="28"/>
           <w:lang w:val="nb-NO"/>
         </w:rPr>
         <w:t>DIREKTORAT</w:t>
       </w:r>
       <w:r>
         <w:rPr>
-          <w:rFonts w:ascii="Figtree" w:hAnsi="Figtree" w:cs="Figtree"/>
+          <w:rFonts w:ascii="Figtree" w:hAnsi="Figtree"/>
           <w:b/>
           <w:spacing w:val="-13"/>
-          <w:sz w:val="25"/>
-          <w:szCs w:val="25"/>
+          <w:sz w:val="28"/>
+          <w:szCs w:val="28"/>
           <w:lang w:val="nb-NO"/>
         </w:rPr>
         <w:t xml:space="preserve"> </w:t>
       </w:r>
       <w:r>
         <w:rPr>
-          <w:rFonts w:ascii="Figtree" w:hAnsi="Figtree" w:cs="Figtree"/>
+          <w:rFonts w:ascii="Figtree" w:hAnsi="Figtree"/>
           <w:b/>
-          <w:sz w:val="25"/>
-          <w:szCs w:val="25"/>
+          <w:sz w:val="28"/>
+          <w:szCs w:val="28"/>
           <w:lang w:val="nb-NO"/>
         </w:rPr>
         <w:t>JENDERAL</w:t>
       </w:r>
       <w:r>
         <w:rPr>
-          <w:rFonts w:ascii="Figtree" w:hAnsi="Figtree" w:cs="Figtree"/>
+          <w:rFonts w:ascii="Figtree" w:hAnsi="Figtree"/>
           <w:b/>
           <w:spacing w:val="-13"/>
-          <w:sz w:val="25"/>
-          <w:szCs w:val="25"/>
+          <w:sz w:val="28"/>
+          <w:szCs w:val="28"/>
           <w:lang w:val="nb-NO"/>
         </w:rPr>
         <w:t xml:space="preserve"> </w:t>
       </w:r>
       <w:r>
         <w:rPr>
-          <w:rFonts w:ascii="Figtree" w:hAnsi="Figtree" w:cs="Figtree"/>
+          <w:rFonts w:ascii="Figtree" w:hAnsi="Figtree"/>
           <w:b/>
-          <w:sz w:val="25"/>
-          <w:szCs w:val="25"/>
+          <w:sz w:val="28"/>
+          <w:szCs w:val="28"/>
           <w:lang w:val="nb-NO"/>
         </w:rPr>
         <w:t>PERHUTANAN</w:t>
       </w:r>
       <w:r>
         <w:rPr>
-          <w:rFonts w:ascii="Figtree" w:hAnsi="Figtree" w:cs="Figtree"/>
+          <w:rFonts w:ascii="Figtree" w:hAnsi="Figtree"/>
           <w:b/>
           <w:spacing w:val="-13"/>
-          <w:sz w:val="25"/>
-          <w:szCs w:val="25"/>
+          <w:sz w:val="28"/>
+          <w:szCs w:val="28"/>
           <w:lang w:val="nb-NO"/>
         </w:rPr>
         <w:t xml:space="preserve"> </w:t>
       </w:r>
       <w:r>
         <w:rPr>
-          <w:rFonts w:ascii="Figtree" w:hAnsi="Figtree" w:cs="Figtree"/>
+          <w:rFonts w:ascii="Figtree" w:hAnsi="Figtree"/>
           <w:b/>
-          <w:sz w:val="25"/>
-          <w:szCs w:val="25"/>
+          <w:sz w:val="28"/>
+          <w:szCs w:val="28"/>
           <w:lang w:val="nb-NO"/>
         </w:rPr>
         <w:t>SOSIAL</w:t>
@@ -177,116 +175,116 @@
     <w:p>
       <w:pPr>
         <w:pStyle w:val="Heading1"/>
+        <w:ind w:right="-188" w:firstLine="1247"/>
         <w:rPr>
           <w:rFonts w:ascii="Cambria" w:hAnsi="Cambria"/>
           <w:b/>
           <w:bCs/>
-          <w:spacing w:val="-2" w:before="0" w:after="100" w:line="240" w:lineRule="auto"/>
+          <w:spacing w:val="-2"/>
           <w:sz w:val="32"/>
           <w:szCs w:val="32"/>
           <w:lang w:val="nb-NO"/>
         </w:rPr>
-        <w:jc w:val="center"/>
-      </w:pPr>
-      <w:r>
-        <w:rPr>
-          <w:rFonts w:ascii="Figtree" w:hAnsi="Figtree" w:cs="Figtree"/>
+      </w:pPr>
+      <w:r>
+        <w:rPr>
+          <w:rFonts w:ascii="Figtree" w:hAnsi="Figtree"/>
           <w:b/>
           <w:bCs/>
-          <w:sz w:val="25"/>
-          <w:szCs w:val="25"/>
+          <w:sz w:val="30"/>
+          <w:szCs w:val="30"/>
           <w:lang w:val="nb-NO"/>
         </w:rPr>
         <w:t xml:space="preserve"> </w:t>
       </w:r>
       <w:r>
         <w:rPr>
-          <w:rFonts w:ascii="Figtree" w:hAnsi="Figtree" w:cs="Figtree"/>
+          <w:rFonts w:ascii="Figtree" w:hAnsi="Figtree"/>
           <w:b/>
           <w:bCs/>
-          <w:sz w:val="25"/>
-          <w:szCs w:val="25"/>
+          <w:sz w:val="30"/>
+          <w:szCs w:val="30"/>
           <w:lang w:val="nb-NO"/>
         </w:rPr>
         <w:t xml:space="preserve"> </w:t>
       </w:r>
       <w:r>
         <w:rPr>
-          <w:rFonts w:ascii="Figtree" w:hAnsi="Figtree" w:cs="Figtree"/>
+          <w:rFonts w:ascii="Figtree" w:hAnsi="Figtree"/>
           <w:b/>
           <w:bCs/>
-          <w:sz w:val="25"/>
-          <w:szCs w:val="25"/>
+          <w:sz w:val="30"/>
+          <w:szCs w:val="30"/>
           <w:lang w:val="nb-NO"/>
         </w:rPr>
         <w:t>DIREKTORAT</w:t>
       </w:r>
       <w:r>
         <w:rPr>
-          <w:rFonts w:ascii="Figtree" w:hAnsi="Figtree" w:cs="Figtree"/>
+          <w:rFonts w:ascii="Figtree" w:hAnsi="Figtree"/>
           <w:b/>
           <w:bCs/>
           <w:spacing w:val="-10"/>
-          <w:sz w:val="25"/>
-          <w:szCs w:val="25"/>
+          <w:sz w:val="30"/>
+          <w:szCs w:val="30"/>
           <w:lang w:val="nb-NO"/>
         </w:rPr>
         <w:t xml:space="preserve"> </w:t>
       </w:r>
       <w:r>
         <w:rPr>
-          <w:rFonts w:ascii="Figtree" w:hAnsi="Figtree" w:cs="Figtree"/>
+          <w:rFonts w:ascii="Figtree" w:hAnsi="Figtree"/>
           <w:b/>
           <w:bCs/>
-          <w:sz w:val="25"/>
-          <w:szCs w:val="25"/>
+          <w:sz w:val="30"/>
+          <w:szCs w:val="30"/>
           <w:lang w:val="nb-NO"/>
         </w:rPr>
         <w:t>PENGENDALIAN</w:t>
       </w:r>
       <w:r>
         <w:rPr>
-          <w:rFonts w:ascii="Figtree" w:hAnsi="Figtree" w:cs="Figtree"/>
+          <w:rFonts w:ascii="Figtree" w:hAnsi="Figtree"/>
           <w:b/>
           <w:bCs/>
           <w:spacing w:val="-8"/>
-          <w:sz w:val="25"/>
-          <w:szCs w:val="25"/>
+          <w:sz w:val="30"/>
+          <w:szCs w:val="30"/>
           <w:lang w:val="nb-NO"/>
         </w:rPr>
         <w:t xml:space="preserve"> </w:t>
       </w:r>
       <w:r>
         <w:rPr>
-          <w:rFonts w:ascii="Figtree" w:hAnsi="Figtree" w:cs="Figtree"/>
+          <w:rFonts w:ascii="Figtree" w:hAnsi="Figtree"/>
           <w:b/>
           <w:bCs/>
-          <w:sz w:val="25"/>
-          <w:szCs w:val="25"/>
+          <w:sz w:val="30"/>
+          <w:szCs w:val="30"/>
           <w:lang w:val="nb-NO"/>
         </w:rPr>
         <w:t>PERHUTANAN</w:t>
       </w:r>
       <w:r>
         <w:rPr>
-          <w:rFonts w:ascii="Figtree" w:hAnsi="Figtree" w:cs="Figtree"/>
+          <w:rFonts w:ascii="Figtree" w:hAnsi="Figtree"/>
           <w:b/>
           <w:bCs/>
           <w:spacing w:val="-7"/>
-          <w:sz w:val="25"/>
-          <w:szCs w:val="25"/>
+          <w:sz w:val="30"/>
+          <w:szCs w:val="30"/>
           <w:lang w:val="nb-NO"/>
         </w:rPr>
         <w:t xml:space="preserve"> </w:t>
       </w:r>
       <w:r>
         <w:rPr>
-          <w:rFonts w:ascii="Figtree" w:hAnsi="Figtree" w:cs="Figtree"/>
+          <w:rFonts w:ascii="Figtree" w:hAnsi="Figtree"/>
           <w:b/>
           <w:bCs/>
           <w:spacing w:val="-2"/>
-          <w:sz w:val="25"/>
-          <w:szCs w:val="25"/>
+          <w:sz w:val="30"/>
+          <w:szCs w:val="30"/>
           <w:lang w:val="nb-NO"/>
         </w:rPr>
         <w:t>SOSIAL</w:t>
@@ -316,31 +314,31 @@
         <mc:AlternateContent>
           <mc:Choice Requires="wps">
             <w:drawing>
-              <wp:anchor distT="0" distB="0" distL="0" distR="0" simplePos="0" relativeHeight="251659264" behindDoc="0" locked="0" layoutInCell="1" allowOverlap="1" wp14:anchorId="33EC01D8" wp14:editId="0FC2FB41">
+              <wp:anchor distT="0" distB="0" distL="0" distR="0" simplePos="0" relativeHeight="251659264" behindDoc="0" locked="0" layoutInCell="1" allowOverlap="1" ns4:anchorId="33EC01D8" ns4:editId="0FC2FB41">
                 <wp:simplePos x="0" y="0"/>
-                <wp:positionH relativeFrom="margin">
-                  <wp:posOffset>0</wp:posOffset>
+                <wp:positionH relativeFrom="page">
+                  <wp:posOffset>356235</wp:posOffset>
                 </wp:positionH>
-                <wp:positionV relativeFrom="paragraph">
-                  <wp:posOffset>50000</wp:posOffset>
+                <wp:positionV relativeFrom="page">
+                  <wp:posOffset>1335405</wp:posOffset>
                 </wp:positionV>
-                <wp:extent cx="6120000" cy="57150"/>
+                <wp:extent cx="7127875" cy="57150"/>
                 <wp:effectExtent l="0" t="0" r="0" b="0"/>
                 <wp:wrapNone/>
                 <wp:docPr id="3" name="Graphic 3"/>
                 <wp:cNvGraphicFramePr>
-                  <a:graphicFrameLocks xmlns:a="http://schemas.openxmlformats.org/drawingml/2006/main"/>
+                  <a:graphicFrameLocks/>
                 </wp:cNvGraphicFramePr>
-                <a:graphic xmlns:a="http://schemas.openxmlformats.org/drawingml/2006/main">
+                <a:graphic>
                   <a:graphicData uri="http://schemas.microsoft.com/office/word/2010/wordprocessingShape">
-                    <wps:wsp>
-                      <wps:cNvSpPr>
+                    <ns8:wsp>
+                      <ns8:cNvSpPr>
                         <a:spLocks/>
-                      </wps:cNvSpPr>
-                      <wps:spPr>
+                      </ns8:cNvSpPr>
+                      <ns8:spPr>
                         <a:xfrm>
                           <a:off x="0" y="0"/>
-                          <a:ext cx="6120000" cy="57150"/>
+                          <a:ext cx="7127875" cy="57150"/>
                         </a:xfrm>
                         <a:custGeom>
                           <a:avLst/>
@@ -349,9 +347,9 @@
                           <a:cxnLst/>
                           <a:rect l="l" t="t" r="r" b="b"/>
                           <a:pathLst>
-                            <a:path w="6120000" h="57150">
+                            <a:path w="7127875" h="57150">
                               <a:moveTo>
-                                <a:pt x="6120000" y="45720"/>
+                                <a:pt x="7127875" y="45720"/>
                               </a:moveTo>
                               <a:lnTo>
                                 <a:pt x="0" y="45720"/>
@@ -360,16 +358,16 @@
                                 <a:pt x="0" y="57150"/>
                               </a:lnTo>
                               <a:lnTo>
-                                <a:pt x="6120000" y="57150"/>
+                                <a:pt x="7127875" y="57150"/>
                               </a:lnTo>
                               <a:lnTo>
-                                <a:pt x="6120000" y="45720"/>
+                                <a:pt x="7127875" y="45720"/>
                               </a:lnTo>
                               <a:close/>
                             </a:path>
-                            <a:path w="6120000" h="57150">
+                            <a:path w="7127875" h="57150">
                               <a:moveTo>
-                                <a:pt x="6120000" y="0"/>
+                                <a:pt x="7127875" y="0"/>
                               </a:moveTo>
                               <a:lnTo>
                                 <a:pt x="0" y="0"/>
@@ -378,10 +376,10 @@
                                 <a:pt x="0" y="34290"/>
                               </a:lnTo>
                               <a:lnTo>
-                                <a:pt x="6120000" y="34290"/>
+                                <a:pt x="7127875" y="34290"/>
                               </a:lnTo>
                               <a:lnTo>
-                                <a:pt x="6120000" y="0"/>
+                                <a:pt x="7127875" y="0"/>
                               </a:lnTo>
                               <a:close/>
                             </a:path>
@@ -390,14 +388,14 @@
                         <a:solidFill>
                           <a:srgbClr val="000000"/>
                         </a:solidFill>
-                      </wps:spPr>
-                      <wps:bodyPr wrap="square" lIns="0" tIns="0" rIns="0" bIns="0" rtlCol="0">
+                      </ns8:spPr>
+                      <ns8:bodyPr wrap="square" lIns="0" tIns="0" rIns="0" bIns="0" rtlCol="0">
                         <a:prstTxWarp prst="textNoShape">
                           <a:avLst/>
                         </a:prstTxWarp>
                         <a:noAutofit/>
-                      </wps:bodyPr>
-                    </wps:wsp>
+                      </ns8:bodyPr>
+                    </ns8:wsp>
                   </a:graphicData>
                 </a:graphic>
               </wp:anchor>
@@ -455,7 +453,6 @@
           <w:szCs w:val="22"/>
           <w:lang w:val="id-ID"/>
         </w:rPr>
-        <w:spacing w:before="240" w:after="60"/>
       </w:pPr>
       <w:r>
         <w:rPr>
@@ -703,8 +700,8 @@
     <w:tbl>
       <w:tblPr>
         <w:tblStyle w:val="TableGrid"/>
-        <w:tblW w:w="9638" w:type="dxa"/>
-        <w:tblInd w:w="0" w:type="dxa"/>
+        <w:tblW w:w="9967" w:type="dxa"/>
+        <w:tblInd w:w="-540" w:type="dxa"/>
         <w:tblBorders>
           <w:top w:val="none" w:sz="0" w:space="0" w:color="auto"/>
           <w:left w:val="none" w:sz="0" w:space="0" w:color="auto"/>
@@ -716,8 +713,8 @@
         <w:tblLook w:val="04A0" w:firstRow="1" w:lastRow="0" w:firstColumn="1" w:lastColumn="0" w:noHBand="0" w:noVBand="1"/>
       </w:tblPr>
       <w:tblGrid>
-        <w:gridCol w:w="1700"/>
-        <w:gridCol w:w="7938"/>
+        <w:gridCol w:w="1816"/>
+        <w:gridCol w:w="8151"/>
       </w:tblGrid>
       <w:tr>
         <w:trPr>
@@ -909,14 +906,14 @@
     </w:tbl>
     <w:tbl>
       <w:tblPr>
-        <w:tblW w:w="9638" w:type="dxa"/>
-        <w:tblInd w:w="0" w:type="dxa"/>
+        <w:tblW w:w="9859" w:type="dxa"/>
+        <w:tblInd w:w="-540" w:type="dxa"/>
         <w:tblLook w:val="04A0" w:firstRow="1" w:lastRow="0" w:firstColumn="1" w:lastColumn="0" w:noHBand="0" w:noVBand="1"/>
       </w:tblPr>
       <w:tblGrid>
-        <w:gridCol w:w="1700"/>
-        <w:gridCol w:w="5938"/>
-        <w:gridCol w:w="2000"/>
+        <w:gridCol w:w="1816"/>
+        <w:gridCol w:w="5781"/>
+        <w:gridCol w:w="2262"/>
       </w:tblGrid>
       <w:tr>
         <w:trPr>
@@ -1568,7 +1565,7 @@
                 <w:szCs w:val="22"/>
                 <w:lang w:val="id-ID"/>
               </w:rPr>
-              <w:t>Kepada          :</w:t>
+              <w:t>Kepada :</w:t>
             </w:r>
           </w:p>
         </w:tc>
@@ -1832,7 +1829,7 @@
                 <w:szCs w:val="22"/>
                 <w:lang w:val="id-ID"/>
               </w:rPr>
-              <w:t xml:space="preserve">Untuk            :     </w:t>
+              <w:t xml:space="preserve">Untuk :</w:t>
             </w:r>
           </w:p>
           <w:p>
@@ -2835,7 +2832,7 @@
     </w:p>
     <w:sectPr>
       <w:pgSz w:w="11906" w:h="16838"/>
-      <w:pgMar w:top="850" w:right="1134" w:bottom="1418" w:left="1134" w:header="706" w:footer="706" w:gutter="0"/>
+      <w:pgMar w:top="567" w:right="1440" w:bottom="360" w:left="1440" w:header="706" w:footer="706" w:gutter="0"/>
       <w:cols w:space="708"/>
       <w:docGrid w:linePitch="360"/>
     </w:sectPr>

</xml_diff>

<commit_message>
fix(docx): pusatkan teks kop surat dan simetriskan garis pembatas sama kiri kanan
</commit_message>
<xml_diff>
--- a/apps/api/assets/template-spt.docx
+++ b/apps/api/assets/template-spt.docx
@@ -4,7 +4,6 @@
   <w:body>
     <w:p>
       <w:pPr>
-        <w:ind w:left="2268" w:right="-188" w:firstLine="851"/>
         <w:rPr>
           <w:rFonts w:ascii="Cambria" w:hAnsi="Cambria"/>
           <w:b/>
@@ -12,11 +11,13 @@
           <w:szCs w:val="28"/>
           <w:lang w:val="nb-NO"/>
         </w:rPr>
+        <w:jc w:val="center"/>
+        <w:spacing w:before="0" w:after="40" w:line="240" w:lineRule="auto"/>
       </w:pPr>
       <w:bookmarkStart w:id="0" w:name="_Hlk190075773"/>
       <w:r>
         <w:rPr>
-          <w:rFonts w:ascii="Figtree" w:hAnsi="Figtree"/>
+          <w:rFonts w:ascii="Cambria" w:hAnsi="Cambria"/>
           <w:b/>
           <w:noProof/>
           <w:sz w:val="28"/>
@@ -26,12 +27,12 @@
           <wp:anchor distT="0" distB="0" distL="0" distR="0" simplePos="0" relativeHeight="251660288" behindDoc="0" locked="0" layoutInCell="1" allowOverlap="1" ns4:anchorId="71CE5EA2" ns4:editId="039405B2">
             <wp:simplePos x="0" y="0"/>
             <wp:positionH relativeFrom="page">
-              <wp:posOffset>717550</wp:posOffset>
+              <wp:posOffset>720000</wp:posOffset>
             </wp:positionH>
-            <wp:positionV relativeFrom="paragraph">
-              <wp:posOffset>-163195</wp:posOffset>
+            <wp:positionV relativeFrom="page">
+              <wp:posOffset>540000</wp:posOffset>
             </wp:positionV>
-            <wp:extent cx="1009650" cy="1009650"/>
+            <wp:extent cx="864000" cy="864000"/>
             <wp:effectExtent l="0" t="0" r="0" b="0"/>
             <wp:wrapNone/>
             <wp:docPr id="4" name="Image 4"/>
@@ -54,7 +55,7 @@
                   <pic:spPr>
                     <a:xfrm>
                       <a:off x="0" y="0"/>
-                      <a:ext cx="1009650" cy="1009650"/>
+                      <a:ext cx="864000" cy="864000"/>
                     </a:xfrm>
                     <a:prstGeom prst="rect">
                       <a:avLst/>
@@ -70,8 +71,8 @@
         <w:rPr>
           <w:rFonts w:ascii="Figtree" w:hAnsi="Figtree"/>
           <w:b/>
-          <w:sz w:val="28"/>
-          <w:szCs w:val="28"/>
+          <w:sz w:val="27"/>
+          <w:szCs w:val="27"/>
           <w:lang w:val="nb-NO"/>
         </w:rPr>
         <w:t xml:space="preserve">KEMENTERIAN KEHUTANAN </w:t>
@@ -79,7 +80,6 @@
     </w:p>
     <w:p>
       <w:pPr>
-        <w:ind w:left="2268" w:right="-188" w:hanging="283"/>
         <w:rPr>
           <w:rFonts w:ascii="Cambria" w:hAnsi="Cambria"/>
           <w:b/>
@@ -87,13 +87,15 @@
           <w:szCs w:val="28"/>
           <w:lang w:val="nb-NO"/>
         </w:rPr>
+        <w:jc w:val="center"/>
+        <w:spacing w:before="0" w:after="40" w:line="240" w:lineRule="auto"/>
       </w:pPr>
       <w:r>
         <w:rPr>
           <w:rFonts w:ascii="Figtree" w:hAnsi="Figtree"/>
           <w:b/>
-          <w:sz w:val="28"/>
-          <w:szCs w:val="28"/>
+          <w:sz w:val="25"/>
+          <w:szCs w:val="25"/>
           <w:lang w:val="nb-NO"/>
         </w:rPr>
         <w:t xml:space="preserve">  </w:t>
@@ -102,8 +104,8 @@
         <w:rPr>
           <w:rFonts w:ascii="Figtree" w:hAnsi="Figtree"/>
           <w:b/>
-          <w:sz w:val="28"/>
-          <w:szCs w:val="28"/>
+          <w:sz w:val="25"/>
+          <w:szCs w:val="25"/>
           <w:lang w:val="nb-NO"/>
         </w:rPr>
         <w:t>DIREKTORAT</w:t>
@@ -112,9 +114,8 @@
         <w:rPr>
           <w:rFonts w:ascii="Figtree" w:hAnsi="Figtree"/>
           <w:b/>
-          <w:spacing w:val="-13"/>
-          <w:sz w:val="28"/>
-          <w:szCs w:val="28"/>
+          <w:sz w:val="25"/>
+          <w:szCs w:val="25"/>
           <w:lang w:val="nb-NO"/>
         </w:rPr>
         <w:t xml:space="preserve"> </w:t>
@@ -123,8 +124,8 @@
         <w:rPr>
           <w:rFonts w:ascii="Figtree" w:hAnsi="Figtree"/>
           <w:b/>
-          <w:sz w:val="28"/>
-          <w:szCs w:val="28"/>
+          <w:sz w:val="25"/>
+          <w:szCs w:val="25"/>
           <w:lang w:val="nb-NO"/>
         </w:rPr>
         <w:t>JENDERAL</w:t>
@@ -133,9 +134,8 @@
         <w:rPr>
           <w:rFonts w:ascii="Figtree" w:hAnsi="Figtree"/>
           <w:b/>
-          <w:spacing w:val="-13"/>
-          <w:sz w:val="28"/>
-          <w:szCs w:val="28"/>
+          <w:sz w:val="25"/>
+          <w:szCs w:val="25"/>
           <w:lang w:val="nb-NO"/>
         </w:rPr>
         <w:t xml:space="preserve"> </w:t>
@@ -144,8 +144,8 @@
         <w:rPr>
           <w:rFonts w:ascii="Figtree" w:hAnsi="Figtree"/>
           <w:b/>
-          <w:sz w:val="28"/>
-          <w:szCs w:val="28"/>
+          <w:sz w:val="25"/>
+          <w:szCs w:val="25"/>
           <w:lang w:val="nb-NO"/>
         </w:rPr>
         <w:t>PERHUTANAN</w:t>
@@ -154,9 +154,8 @@
         <w:rPr>
           <w:rFonts w:ascii="Figtree" w:hAnsi="Figtree"/>
           <w:b/>
-          <w:spacing w:val="-13"/>
-          <w:sz w:val="28"/>
-          <w:szCs w:val="28"/>
+          <w:sz w:val="25"/>
+          <w:szCs w:val="25"/>
           <w:lang w:val="nb-NO"/>
         </w:rPr>
         <w:t xml:space="preserve"> </w:t>
@@ -165,8 +164,8 @@
         <w:rPr>
           <w:rFonts w:ascii="Figtree" w:hAnsi="Figtree"/>
           <w:b/>
-          <w:sz w:val="28"/>
-          <w:szCs w:val="28"/>
+          <w:sz w:val="25"/>
+          <w:szCs w:val="25"/>
           <w:lang w:val="nb-NO"/>
         </w:rPr>
         <w:t>SOSIAL</w:t>
@@ -175,7 +174,6 @@
     <w:p>
       <w:pPr>
         <w:pStyle w:val="Heading1"/>
-        <w:ind w:right="-188" w:firstLine="1247"/>
         <w:rPr>
           <w:rFonts w:ascii="Cambria" w:hAnsi="Cambria"/>
           <w:b/>
@@ -185,14 +183,16 @@
           <w:szCs w:val="32"/>
           <w:lang w:val="nb-NO"/>
         </w:rPr>
+        <w:jc w:val="center"/>
+        <w:spacing w:before="0" w:after="40" w:line="240" w:lineRule="auto"/>
       </w:pPr>
       <w:r>
         <w:rPr>
           <w:rFonts w:ascii="Figtree" w:hAnsi="Figtree"/>
           <w:b/>
           <w:bCs/>
-          <w:sz w:val="30"/>
-          <w:szCs w:val="30"/>
+          <w:sz w:val="25"/>
+          <w:szCs w:val="25"/>
           <w:lang w:val="nb-NO"/>
         </w:rPr>
         <w:t xml:space="preserve"> </w:t>
@@ -202,8 +202,8 @@
           <w:rFonts w:ascii="Figtree" w:hAnsi="Figtree"/>
           <w:b/>
           <w:bCs/>
-          <w:sz w:val="30"/>
-          <w:szCs w:val="30"/>
+          <w:sz w:val="25"/>
+          <w:szCs w:val="25"/>
           <w:lang w:val="nb-NO"/>
         </w:rPr>
         <w:t xml:space="preserve"> </w:t>
@@ -213,8 +213,8 @@
           <w:rFonts w:ascii="Figtree" w:hAnsi="Figtree"/>
           <w:b/>
           <w:bCs/>
-          <w:sz w:val="30"/>
-          <w:szCs w:val="30"/>
+          <w:sz w:val="25"/>
+          <w:szCs w:val="25"/>
           <w:lang w:val="nb-NO"/>
         </w:rPr>
         <w:t>DIREKTORAT</w:t>
@@ -224,9 +224,8 @@
           <w:rFonts w:ascii="Figtree" w:hAnsi="Figtree"/>
           <w:b/>
           <w:bCs/>
-          <w:spacing w:val="-10"/>
-          <w:sz w:val="30"/>
-          <w:szCs w:val="30"/>
+          <w:sz w:val="25"/>
+          <w:szCs w:val="25"/>
           <w:lang w:val="nb-NO"/>
         </w:rPr>
         <w:t xml:space="preserve"> </w:t>
@@ -236,8 +235,8 @@
           <w:rFonts w:ascii="Figtree" w:hAnsi="Figtree"/>
           <w:b/>
           <w:bCs/>
-          <w:sz w:val="30"/>
-          <w:szCs w:val="30"/>
+          <w:sz w:val="25"/>
+          <w:szCs w:val="25"/>
           <w:lang w:val="nb-NO"/>
         </w:rPr>
         <w:t>PENGENDALIAN</w:t>
@@ -247,9 +246,8 @@
           <w:rFonts w:ascii="Figtree" w:hAnsi="Figtree"/>
           <w:b/>
           <w:bCs/>
-          <w:spacing w:val="-8"/>
-          <w:sz w:val="30"/>
-          <w:szCs w:val="30"/>
+          <w:sz w:val="25"/>
+          <w:szCs w:val="25"/>
           <w:lang w:val="nb-NO"/>
         </w:rPr>
         <w:t xml:space="preserve"> </w:t>
@@ -259,8 +257,8 @@
           <w:rFonts w:ascii="Figtree" w:hAnsi="Figtree"/>
           <w:b/>
           <w:bCs/>
-          <w:sz w:val="30"/>
-          <w:szCs w:val="30"/>
+          <w:sz w:val="25"/>
+          <w:szCs w:val="25"/>
           <w:lang w:val="nb-NO"/>
         </w:rPr>
         <w:t>PERHUTANAN</w:t>
@@ -270,9 +268,8 @@
           <w:rFonts w:ascii="Figtree" w:hAnsi="Figtree"/>
           <w:b/>
           <w:bCs/>
-          <w:spacing w:val="-7"/>
-          <w:sz w:val="30"/>
-          <w:szCs w:val="30"/>
+          <w:sz w:val="25"/>
+          <w:szCs w:val="25"/>
           <w:lang w:val="nb-NO"/>
         </w:rPr>
         <w:t xml:space="preserve"> </w:t>
@@ -282,9 +279,8 @@
           <w:rFonts w:ascii="Figtree" w:hAnsi="Figtree"/>
           <w:b/>
           <w:bCs/>
-          <w:spacing w:val="-2"/>
-          <w:sz w:val="30"/>
-          <w:szCs w:val="30"/>
+          <w:sz w:val="25"/>
+          <w:szCs w:val="25"/>
           <w:lang w:val="nb-NO"/>
         </w:rPr>
         <w:t>SOSIAL</w:t>
@@ -317,12 +313,12 @@
               <wp:anchor distT="0" distB="0" distL="0" distR="0" simplePos="0" relativeHeight="251659264" behindDoc="0" locked="0" layoutInCell="1" allowOverlap="1" ns4:anchorId="33EC01D8" ns4:editId="0FC2FB41">
                 <wp:simplePos x="0" y="0"/>
                 <wp:positionH relativeFrom="page">
-                  <wp:posOffset>356235</wp:posOffset>
+                  <wp:posOffset>720000</wp:posOffset>
                 </wp:positionH>
                 <wp:positionV relativeFrom="page">
                   <wp:posOffset>1335405</wp:posOffset>
                 </wp:positionV>
-                <wp:extent cx="7127875" cy="57150"/>
+                <wp:extent cx="6120000" cy="57150"/>
                 <wp:effectExtent l="0" t="0" r="0" b="0"/>
                 <wp:wrapNone/>
                 <wp:docPr id="3" name="Graphic 3"/>
@@ -338,7 +334,7 @@
                       <ns8:spPr>
                         <a:xfrm>
                           <a:off x="0" y="0"/>
-                          <a:ext cx="7127875" cy="57150"/>
+                          <a:ext cx="6120000" cy="57150"/>
                         </a:xfrm>
                         <a:custGeom>
                           <a:avLst/>
@@ -403,7 +399,7 @@
           </mc:Choice>
           <mc:Fallback>
             <w:pict>
-              <v:shape w14:anchorId="6EA5F5A4" id="Graphic 3" o:spid="_x0000_s1026" style="position:absolute;margin-left:28.05pt;margin-top:105.15pt;width:561.25pt;height:4.5pt;z-index:251659264;visibility:visible;mso-wrap-style:square;mso-wrap-distance-left:0;mso-wrap-distance-top:0;mso-wrap-distance-right:0;mso-wrap-distance-bottom:0;mso-position-horizontal:absolute;mso-position-horizontal-relative:page;mso-position-vertical:absolute;mso-position-vertical-relative:page;v-text-anchor:top" coordsize="7127875,57150" o:gfxdata="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" path="m7127875,45720l,45720,,57150r7127875,l7127875,45720xem7127875,l,,,34290r7127875,l7127875,xe" fillcolor="black" stroked="f">
+              <v:shape w14:anchorId="6EA5F5A4" id="Graphic 3" o:spid="_x0000_s1026" style="position:absolute;margin-left:56.7pt;margin-top:12pt;width:481.9pt;height:4.5pt;z-index:251659264;visibility:visible;mso-wrap-style:square;mso-width-percent:0;mso-height-percent:0;mso-wrap-distance-left:9pt;mso-wrap-distance-top:0;mso-wrap-distance-right:9pt;mso-wrap-distance-bottom:0;mso-position-horizontal:absolute;mso-position-horizontal-relative:page;mso-position-vertical:absolute;mso-position-vertical-relative:paragraph;mso-width-percent:0;mso-height-percent:0;mso-width-relative:page;mso-height-relative:page;v-text-anchor:top" coordsize="7127875,57150" o:gfxdata="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" path="m7127875,45720l,45720,,57150r7127875,l7127875,45720xem7127875,l,,,34290r7127875,l7127875,xe" fillcolor="black" stroked="f">
                 <v:path arrowok="t"/>
                 <w10:wrap anchorx="page" anchory="page"/>
               </v:shape>
@@ -700,8 +696,8 @@
     <w:tbl>
       <w:tblPr>
         <w:tblStyle w:val="TableGrid"/>
-        <w:tblW w:w="9967" w:type="dxa"/>
-        <w:tblInd w:w="-540" w:type="dxa"/>
+        <w:tblW w:w="9638" w:type="dxa"/>
+        <w:tblInd w:w="0" w:type="dxa"/>
         <w:tblBorders>
           <w:top w:val="none" w:sz="0" w:space="0" w:color="auto"/>
           <w:left w:val="none" w:sz="0" w:space="0" w:color="auto"/>
@@ -713,8 +709,8 @@
         <w:tblLook w:val="04A0" w:firstRow="1" w:lastRow="0" w:firstColumn="1" w:lastColumn="0" w:noHBand="0" w:noVBand="1"/>
       </w:tblPr>
       <w:tblGrid>
-        <w:gridCol w:w="1816"/>
-        <w:gridCol w:w="8151"/>
+        <w:gridCol w:w="2000"/>
+        <w:gridCol w:w="7638"/>
       </w:tblGrid>
       <w:tr>
         <w:trPr>
@@ -722,7 +718,7 @@
         </w:trPr>
         <w:tc>
           <w:tcPr>
-            <w:tcW w:w="1816" w:type="dxa"/>
+            <w:tcW w:w="2000" w:type="dxa"/>
           </w:tcPr>
           <w:p>
             <w:pPr>
@@ -757,7 +753,7 @@
         </w:tc>
         <w:tc>
           <w:tcPr>
-            <w:tcW w:w="8151" w:type="dxa"/>
+            <w:tcW w:w="7638" w:type="dxa"/>
           </w:tcPr>
           <w:p>
             <w:pPr>
@@ -906,14 +902,14 @@
     </w:tbl>
     <w:tbl>
       <w:tblPr>
-        <w:tblW w:w="9859" w:type="dxa"/>
-        <w:tblInd w:w="-540" w:type="dxa"/>
+        <w:tblW w:w="9638" w:type="dxa"/>
+        <w:tblInd w:w="0" w:type="dxa"/>
         <w:tblLook w:val="04A0" w:firstRow="1" w:lastRow="0" w:firstColumn="1" w:lastColumn="0" w:noHBand="0" w:noVBand="1"/>
       </w:tblPr>
       <w:tblGrid>
-        <w:gridCol w:w="1816"/>
-        <w:gridCol w:w="5781"/>
-        <w:gridCol w:w="2262"/>
+        <w:gridCol w:w="2000"/>
+        <w:gridCol w:w="5638"/>
+        <w:gridCol w:w="2000"/>
       </w:tblGrid>
       <w:tr>
         <w:trPr>
@@ -921,7 +917,7 @@
         </w:trPr>
         <w:tc>
           <w:tcPr>
-            <w:tcW w:w="1816" w:type="dxa"/>
+            <w:tcW w:w="2000" w:type="dxa"/>
           </w:tcPr>
           <w:p>
             <w:pPr>
@@ -1068,7 +1064,7 @@
         </w:tc>
         <w:tc>
           <w:tcPr>
-            <w:tcW w:w="8043" w:type="dxa"/>
+            <w:tcW w:w="7638" w:type="dxa"/>
             <w:gridSpan w:val="2"/>
           </w:tcPr>
           <w:p>
@@ -1501,7 +1497,7 @@
         </w:trPr>
         <w:tc>
           <w:tcPr>
-            <w:tcW w:w="9854" w:type="dxa"/>
+            <w:tcW w:w="9638" w:type="dxa"/>
             <w:gridSpan w:val="3"/>
           </w:tcPr>
           <w:p>
@@ -1543,7 +1539,7 @@
         </w:trPr>
         <w:tc>
           <w:tcPr>
-            <w:tcW w:w="1816" w:type="dxa"/>
+            <w:tcW w:w="2000" w:type="dxa"/>
           </w:tcPr>
           <w:p>
             <w:pPr>
@@ -1571,7 +1567,7 @@
         </w:tc>
         <w:tc>
           <w:tcPr>
-            <w:tcW w:w="8043" w:type="dxa"/>
+            <w:tcW w:w="7638" w:type="dxa"/>
             <w:gridSpan w:val="2"/>
           </w:tcPr>
           <w:p>
@@ -1810,7 +1806,7 @@
         </w:trPr>
         <w:tc>
           <w:tcPr>
-            <w:tcW w:w="1816" w:type="dxa"/>
+            <w:tcW w:w="2000" w:type="dxa"/>
           </w:tcPr>
           <w:p>
             <w:pPr>
@@ -1896,7 +1892,7 @@
         </w:tc>
         <w:tc>
           <w:tcPr>
-            <w:tcW w:w="8043" w:type="dxa"/>
+            <w:tcW w:w="7638" w:type="dxa"/>
             <w:gridSpan w:val="2"/>
           </w:tcPr>
           <w:p>
@@ -2370,7 +2366,7 @@
         </w:trPr>
         <w:tc>
           <w:tcPr>
-            <w:tcW w:w="7597" w:type="dxa"/>
+            <w:tcW w:w="9638" w:type="dxa"/>
             <w:gridSpan w:val="2"/>
           </w:tcPr>
           <w:p>
@@ -2832,7 +2828,7 @@
     </w:p>
     <w:sectPr>
       <w:pgSz w:w="11906" w:h="16838"/>
-      <w:pgMar w:top="567" w:right="1440" w:bottom="360" w:left="1440" w:header="706" w:footer="706" w:gutter="0"/>
+      <w:pgMar w:top="850" w:right="1134" w:bottom="1418" w:left="1134" w:header="706" w:footer="706" w:gutter="0"/>
       <w:cols w:space="708"/>
       <w:docGrid w:linePitch="360"/>
     </w:sectPr>

</xml_diff>

<commit_message>
fix(st): terapkan ukuran logo 2.65cm dan font kop sesuai permenhut 1/2025 dan st.265
</commit_message>
<xml_diff>
--- a/apps/api/assets/template-spt.docx
+++ b/apps/api/assets/template-spt.docx
@@ -30,9 +30,9 @@
               <wp:posOffset>720000</wp:posOffset>
             </wp:positionH>
             <wp:positionV relativeFrom="page">
-              <wp:posOffset>540000</wp:posOffset>
+              <wp:posOffset>480000</wp:posOffset>
             </wp:positionV>
-            <wp:extent cx="864000" cy="864000"/>
+            <wp:extent cx="954000" cy="954000"/>
             <wp:effectExtent l="0" t="0" r="0" b="0"/>
             <wp:wrapNone/>
             <wp:docPr id="4" name="Image 4"/>
@@ -55,7 +55,7 @@
                   <pic:spPr>
                     <a:xfrm>
                       <a:off x="0" y="0"/>
-                      <a:ext cx="864000" cy="864000"/>
+                      <a:ext cx="954000" cy="954000"/>
                     </a:xfrm>
                     <a:prstGeom prst="rect">
                       <a:avLst/>
@@ -71,8 +71,8 @@
         <w:rPr>
           <w:rFonts w:ascii="Figtree" w:hAnsi="Figtree"/>
           <w:b/>
-          <w:sz w:val="27"/>
-          <w:szCs w:val="27"/>
+          <w:sz w:val="28"/>
+          <w:szCs w:val="28"/>
           <w:lang w:val="nb-NO"/>
         </w:rPr>
         <w:t xml:space="preserve">KEMENTERIAN KEHUTANAN </w:t>
@@ -94,8 +94,8 @@
         <w:rPr>
           <w:rFonts w:ascii="Figtree" w:hAnsi="Figtree"/>
           <w:b/>
-          <w:sz w:val="25"/>
-          <w:szCs w:val="25"/>
+          <w:sz w:val="26"/>
+          <w:szCs w:val="26"/>
           <w:lang w:val="nb-NO"/>
         </w:rPr>
         <w:t xml:space="preserve">  </w:t>
@@ -104,8 +104,8 @@
         <w:rPr>
           <w:rFonts w:ascii="Figtree" w:hAnsi="Figtree"/>
           <w:b/>
-          <w:sz w:val="25"/>
-          <w:szCs w:val="25"/>
+          <w:sz w:val="26"/>
+          <w:szCs w:val="26"/>
           <w:lang w:val="nb-NO"/>
         </w:rPr>
         <w:t>DIREKTORAT</w:t>
@@ -114,8 +114,8 @@
         <w:rPr>
           <w:rFonts w:ascii="Figtree" w:hAnsi="Figtree"/>
           <w:b/>
-          <w:sz w:val="25"/>
-          <w:szCs w:val="25"/>
+          <w:sz w:val="26"/>
+          <w:szCs w:val="26"/>
           <w:lang w:val="nb-NO"/>
         </w:rPr>
         <w:t xml:space="preserve"> </w:t>
@@ -124,8 +124,8 @@
         <w:rPr>
           <w:rFonts w:ascii="Figtree" w:hAnsi="Figtree"/>
           <w:b/>
-          <w:sz w:val="25"/>
-          <w:szCs w:val="25"/>
+          <w:sz w:val="26"/>
+          <w:szCs w:val="26"/>
           <w:lang w:val="nb-NO"/>
         </w:rPr>
         <w:t>JENDERAL</w:t>
@@ -134,8 +134,8 @@
         <w:rPr>
           <w:rFonts w:ascii="Figtree" w:hAnsi="Figtree"/>
           <w:b/>
-          <w:sz w:val="25"/>
-          <w:szCs w:val="25"/>
+          <w:sz w:val="26"/>
+          <w:szCs w:val="26"/>
           <w:lang w:val="nb-NO"/>
         </w:rPr>
         <w:t xml:space="preserve"> </w:t>
@@ -144,8 +144,8 @@
         <w:rPr>
           <w:rFonts w:ascii="Figtree" w:hAnsi="Figtree"/>
           <w:b/>
-          <w:sz w:val="25"/>
-          <w:szCs w:val="25"/>
+          <w:sz w:val="26"/>
+          <w:szCs w:val="26"/>
           <w:lang w:val="nb-NO"/>
         </w:rPr>
         <w:t>PERHUTANAN</w:t>
@@ -154,8 +154,8 @@
         <w:rPr>
           <w:rFonts w:ascii="Figtree" w:hAnsi="Figtree"/>
           <w:b/>
-          <w:sz w:val="25"/>
-          <w:szCs w:val="25"/>
+          <w:sz w:val="26"/>
+          <w:szCs w:val="26"/>
           <w:lang w:val="nb-NO"/>
         </w:rPr>
         <w:t xml:space="preserve"> </w:t>
@@ -164,8 +164,8 @@
         <w:rPr>
           <w:rFonts w:ascii="Figtree" w:hAnsi="Figtree"/>
           <w:b/>
-          <w:sz w:val="25"/>
-          <w:szCs w:val="25"/>
+          <w:sz w:val="26"/>
+          <w:szCs w:val="26"/>
           <w:lang w:val="nb-NO"/>
         </w:rPr>
         <w:t>SOSIAL</w:t>

</xml_diff>

<commit_message>
fix(docx): kembalikan kop, margin, dan font surat tugas ke format ST.265 dan CONTOH SPT
</commit_message>
<xml_diff>
--- a/apps/api/assets/template-spt.docx
+++ b/apps/api/assets/template-spt.docx
@@ -1,9 +1,10 @@
 
 <file path=word/document.xml><?xml version="1.0" encoding="utf-8"?>
-<w:document xmlns:a="http://schemas.openxmlformats.org/drawingml/2006/main" xmlns:mc="http://schemas.openxmlformats.org/markup-compatibility/2006" xmlns:ns4="http://schemas.microsoft.com/office/word/2010/wordprocessingDrawing" xmlns:ns8="http://schemas.microsoft.com/office/word/2010/wordprocessingShape" xmlns:o="urn:schemas-microsoft-com:office:office" xmlns:pic="http://schemas.openxmlformats.org/drawingml/2006/picture" xmlns:r="http://schemas.openxmlformats.org/officeDocument/2006/relationships" xmlns:v="urn:schemas-microsoft-com:vml" xmlns:w="http://schemas.openxmlformats.org/wordprocessingml/2006/main" xmlns:w10="urn:schemas-microsoft-com:office:word" xmlns:w14="http://schemas.microsoft.com/office/word/2010/wordml" xmlns:wp="http://schemas.openxmlformats.org/drawingml/2006/wordprocessingDrawing" mc:Ignorable="w14 w15 w16se w16cid w16 w16cex w16sdtdh wp14">
+<w:document xmlns:wpc="http://schemas.microsoft.com/office/word/2010/wordprocessingCanvas" xmlns:cx="http://schemas.microsoft.com/office/drawing/2014/chartex" xmlns:cx1="http://schemas.microsoft.com/office/drawing/2015/9/8/chartex" xmlns:cx2="http://schemas.microsoft.com/office/drawing/2015/10/21/chartex" xmlns:cx3="http://schemas.microsoft.com/office/drawing/2016/5/9/chartex" xmlns:cx4="http://schemas.microsoft.com/office/drawing/2016/5/10/chartex" xmlns:cx5="http://schemas.microsoft.com/office/drawing/2016/5/11/chartex" xmlns:cx6="http://schemas.microsoft.com/office/drawing/2016/5/12/chartex" xmlns:cx7="http://schemas.microsoft.com/office/drawing/2016/5/13/chartex" xmlns:cx8="http://schemas.microsoft.com/office/drawing/2016/5/14/chartex" xmlns:mc="http://schemas.openxmlformats.org/markup-compatibility/2006" xmlns:aink="http://schemas.microsoft.com/office/drawing/2016/ink" xmlns:am3d="http://schemas.microsoft.com/office/drawing/2017/model3d" xmlns:o="urn:schemas-microsoft-com:office:office" xmlns:oel="http://schemas.microsoft.com/office/2019/extlst" xmlns:r="http://schemas.openxmlformats.org/officeDocument/2006/relationships" xmlns:m="http://schemas.openxmlformats.org/officeDocument/2006/math" xmlns:v="urn:schemas-microsoft-com:vml" xmlns:wp14="http://schemas.microsoft.com/office/word/2010/wordprocessingDrawing" xmlns:wp="http://schemas.openxmlformats.org/drawingml/2006/wordprocessingDrawing" xmlns:w10="urn:schemas-microsoft-com:office:word" xmlns:w="http://schemas.openxmlformats.org/wordprocessingml/2006/main" xmlns:w14="http://schemas.microsoft.com/office/word/2010/wordml" xmlns:w15="http://schemas.microsoft.com/office/word/2012/wordml" xmlns:w16cex="http://schemas.microsoft.com/office/word/2018/wordml/cex" xmlns:w16cid="http://schemas.microsoft.com/office/word/2016/wordml/cid" xmlns:w16="http://schemas.microsoft.com/office/word/2018/wordml" xmlns:w16sdtdh="http://schemas.microsoft.com/office/word/2020/wordml/sdtdatahash" xmlns:w16se="http://schemas.microsoft.com/office/word/2015/wordml/symex" xmlns:wpg="http://schemas.microsoft.com/office/word/2010/wordprocessingGroup" xmlns:wpi="http://schemas.microsoft.com/office/word/2010/wordprocessingInk" xmlns:wne="http://schemas.microsoft.com/office/word/2006/wordml" xmlns:wps="http://schemas.microsoft.com/office/word/2010/wordprocessingShape" mc:Ignorable="w14 w15 w16se w16cid w16 w16cex w16sdtdh wp14">
   <w:body>
     <w:p>
       <w:pPr>
+        <w:ind w:left="2268" w:right="-188" w:firstLine="851"/>
         <w:rPr>
           <w:rFonts w:ascii="Cambria" w:hAnsi="Cambria"/>
           <w:b/>
@@ -11,8 +12,6 @@
           <w:szCs w:val="28"/>
           <w:lang w:val="nb-NO"/>
         </w:rPr>
-        <w:jc w:val="center"/>
-        <w:spacing w:before="0" w:after="40" w:line="240" w:lineRule="auto"/>
       </w:pPr>
       <w:bookmarkStart w:id="0" w:name="_Hlk190075773"/>
       <w:r>
@@ -24,24 +23,24 @@
           <w:szCs w:val="28"/>
         </w:rPr>
         <w:drawing>
-          <wp:anchor distT="0" distB="0" distL="0" distR="0" simplePos="0" relativeHeight="251660288" behindDoc="0" locked="0" layoutInCell="1" allowOverlap="1" ns4:anchorId="71CE5EA2" ns4:editId="039405B2">
+          <wp:anchor distT="0" distB="0" distL="0" distR="0" simplePos="0" relativeHeight="251660288" behindDoc="0" locked="0" layoutInCell="1" allowOverlap="1" wp14:anchorId="71CE5EA2" wp14:editId="039405B2">
             <wp:simplePos x="0" y="0"/>
             <wp:positionH relativeFrom="page">
-              <wp:posOffset>720000</wp:posOffset>
+              <wp:posOffset>717550</wp:posOffset>
             </wp:positionH>
-            <wp:positionV relativeFrom="page">
-              <wp:posOffset>480000</wp:posOffset>
+            <wp:positionV relativeFrom="paragraph">
+              <wp:posOffset>-163195</wp:posOffset>
             </wp:positionV>
-            <wp:extent cx="954000" cy="954000"/>
+            <wp:extent cx="1009650" cy="1009650"/>
             <wp:effectExtent l="0" t="0" r="0" b="0"/>
             <wp:wrapNone/>
             <wp:docPr id="4" name="Image 4"/>
             <wp:cNvGraphicFramePr>
-              <a:graphicFrameLocks/>
+              <a:graphicFrameLocks xmlns:a="http://schemas.openxmlformats.org/drawingml/2006/main"/>
             </wp:cNvGraphicFramePr>
-            <a:graphic>
+            <a:graphic xmlns:a="http://schemas.openxmlformats.org/drawingml/2006/main">
               <a:graphicData uri="http://schemas.openxmlformats.org/drawingml/2006/picture">
-                <pic:pic>
+                <pic:pic xmlns:pic="http://schemas.openxmlformats.org/drawingml/2006/picture">
                   <pic:nvPicPr>
                     <pic:cNvPr id="4" name="Image 4"/>
                     <pic:cNvPicPr/>
@@ -55,7 +54,7 @@
                   <pic:spPr>
                     <a:xfrm>
                       <a:off x="0" y="0"/>
-                      <a:ext cx="954000" cy="954000"/>
+                      <a:ext cx="1009650" cy="1009650"/>
                     </a:xfrm>
                     <a:prstGeom prst="rect">
                       <a:avLst/>
@@ -69,111 +68,114 @@
       </w:r>
       <w:r>
         <w:rPr>
-          <w:rFonts w:ascii="Figtree" w:hAnsi="Figtree"/>
-          <w:b/>
-          <w:sz w:val="28"/>
-          <w:szCs w:val="28"/>
-          <w:lang w:val="nb-NO"/>
-        </w:rPr>
-        <w:t xml:space="preserve">KEMENTERIAN KEHUTANAN </w:t>
-      </w:r>
-    </w:p>
-    <w:p>
-      <w:pPr>
-        <w:rPr>
           <w:rFonts w:ascii="Cambria" w:hAnsi="Cambria"/>
           <w:b/>
           <w:sz w:val="28"/>
           <w:szCs w:val="28"/>
           <w:lang w:val="nb-NO"/>
         </w:rPr>
-        <w:jc w:val="center"/>
-        <w:spacing w:before="0" w:after="40" w:line="240" w:lineRule="auto"/>
-      </w:pPr>
-      <w:r>
-        <w:rPr>
-          <w:rFonts w:ascii="Figtree" w:hAnsi="Figtree"/>
-          <w:b/>
-          <w:sz w:val="26"/>
-          <w:szCs w:val="26"/>
-          <w:lang w:val="nb-NO"/>
-        </w:rPr>
-        <w:t xml:space="preserve">  </w:t>
-      </w:r>
-      <w:r>
-        <w:rPr>
-          <w:rFonts w:ascii="Figtree" w:hAnsi="Figtree"/>
-          <w:b/>
-          <w:sz w:val="26"/>
-          <w:szCs w:val="26"/>
-          <w:lang w:val="nb-NO"/>
-        </w:rPr>
-        <w:t>DIREKTORAT</w:t>
-      </w:r>
-      <w:r>
-        <w:rPr>
-          <w:rFonts w:ascii="Figtree" w:hAnsi="Figtree"/>
-          <w:b/>
-          <w:sz w:val="26"/>
-          <w:szCs w:val="26"/>
-          <w:lang w:val="nb-NO"/>
-        </w:rPr>
-        <w:t xml:space="preserve"> </w:t>
-      </w:r>
-      <w:r>
-        <w:rPr>
-          <w:rFonts w:ascii="Figtree" w:hAnsi="Figtree"/>
-          <w:b/>
-          <w:sz w:val="26"/>
-          <w:szCs w:val="26"/>
-          <w:lang w:val="nb-NO"/>
-        </w:rPr>
-        <w:t>JENDERAL</w:t>
-      </w:r>
-      <w:r>
-        <w:rPr>
-          <w:rFonts w:ascii="Figtree" w:hAnsi="Figtree"/>
-          <w:b/>
-          <w:sz w:val="26"/>
-          <w:szCs w:val="26"/>
-          <w:lang w:val="nb-NO"/>
-        </w:rPr>
-        <w:t xml:space="preserve"> </w:t>
-      </w:r>
-      <w:r>
-        <w:rPr>
-          <w:rFonts w:ascii="Figtree" w:hAnsi="Figtree"/>
-          <w:b/>
-          <w:sz w:val="26"/>
-          <w:szCs w:val="26"/>
-          <w:lang w:val="nb-NO"/>
-        </w:rPr>
-        <w:t>PERHUTANAN</w:t>
-      </w:r>
-      <w:r>
-        <w:rPr>
-          <w:rFonts w:ascii="Figtree" w:hAnsi="Figtree"/>
-          <w:b/>
-          <w:sz w:val="26"/>
-          <w:szCs w:val="26"/>
-          <w:lang w:val="nb-NO"/>
-        </w:rPr>
-        <w:t xml:space="preserve"> </w:t>
-      </w:r>
-      <w:r>
-        <w:rPr>
-          <w:rFonts w:ascii="Figtree" w:hAnsi="Figtree"/>
-          <w:b/>
-          <w:sz w:val="26"/>
-          <w:szCs w:val="26"/>
-          <w:lang w:val="nb-NO"/>
-        </w:rPr>
-        <w:t>SOSIAL</w:t>
+        <w:t xml:space="preserve">KEMENTERIAN KEHUTANAN </w:t>
       </w:r>
     </w:p>
     <w:p>
       <w:pPr>
+        <w:ind w:left="2268" w:right="-188" w:hanging="283"/>
+        <w:rPr>
+          <w:rFonts w:ascii="Cambria" w:hAnsi="Cambria"/>
+          <w:b/>
+          <w:sz w:val="28"/>
+          <w:szCs w:val="28"/>
+          <w:lang w:val="nb-NO"/>
+        </w:rPr>
+      </w:pPr>
+      <w:r>
+        <w:rPr>
+          <w:rFonts w:ascii="Cambria" w:hAnsi="Cambria"/>
+          <w:b/>
+          <w:sz w:val="28"/>
+          <w:szCs w:val="28"/>
+          <w:lang w:val="nb-NO"/>
+        </w:rPr>
+        <w:t xml:space="preserve">  </w:t>
+      </w:r>
+      <w:r>
+        <w:rPr>
+          <w:rFonts w:ascii="Cambria" w:hAnsi="Cambria"/>
+          <w:b/>
+          <w:sz w:val="28"/>
+          <w:szCs w:val="28"/>
+          <w:lang w:val="nb-NO"/>
+        </w:rPr>
+        <w:t>DIREKTORAT</w:t>
+      </w:r>
+      <w:r>
+        <w:rPr>
+          <w:rFonts w:ascii="Cambria" w:hAnsi="Cambria"/>
+          <w:b/>
+          <w:spacing w:val="-13"/>
+          <w:sz w:val="28"/>
+          <w:szCs w:val="28"/>
+          <w:lang w:val="nb-NO"/>
+        </w:rPr>
+        <w:t xml:space="preserve"> </w:t>
+      </w:r>
+      <w:r>
+        <w:rPr>
+          <w:rFonts w:ascii="Cambria" w:hAnsi="Cambria"/>
+          <w:b/>
+          <w:sz w:val="28"/>
+          <w:szCs w:val="28"/>
+          <w:lang w:val="nb-NO"/>
+        </w:rPr>
+        <w:t>JENDERAL</w:t>
+      </w:r>
+      <w:r>
+        <w:rPr>
+          <w:rFonts w:ascii="Cambria" w:hAnsi="Cambria"/>
+          <w:b/>
+          <w:spacing w:val="-13"/>
+          <w:sz w:val="28"/>
+          <w:szCs w:val="28"/>
+          <w:lang w:val="nb-NO"/>
+        </w:rPr>
+        <w:t xml:space="preserve"> </w:t>
+      </w:r>
+      <w:r>
+        <w:rPr>
+          <w:rFonts w:ascii="Cambria" w:hAnsi="Cambria"/>
+          <w:b/>
+          <w:sz w:val="28"/>
+          <w:szCs w:val="28"/>
+          <w:lang w:val="nb-NO"/>
+        </w:rPr>
+        <w:t>PERHUTANAN</w:t>
+      </w:r>
+      <w:r>
+        <w:rPr>
+          <w:rFonts w:ascii="Cambria" w:hAnsi="Cambria"/>
+          <w:b/>
+          <w:spacing w:val="-13"/>
+          <w:sz w:val="28"/>
+          <w:szCs w:val="28"/>
+          <w:lang w:val="nb-NO"/>
+        </w:rPr>
+        <w:t xml:space="preserve"> </w:t>
+      </w:r>
+      <w:r>
+        <w:rPr>
+          <w:rFonts w:ascii="Cambria" w:hAnsi="Cambria"/>
+          <w:b/>
+          <w:sz w:val="28"/>
+          <w:szCs w:val="28"/>
+          <w:lang w:val="nb-NO"/>
+        </w:rPr>
+        <w:t>SOSIAL</w:t>
+      </w:r>
+    </w:p>
+    <w:p>
+      <w:pPr>
         <w:pStyle w:val="Heading1"/>
+        <w:ind w:right="-188" w:firstLine="1247"/>
         <w:rPr>
           <w:rFonts w:ascii="Cambria" w:hAnsi="Cambria"/>
           <w:b/>
@@ -183,104 +185,106 @@
           <w:szCs w:val="32"/>
           <w:lang w:val="nb-NO"/>
         </w:rPr>
-        <w:jc w:val="center"/>
-        <w:spacing w:before="0" w:after="40" w:line="240" w:lineRule="auto"/>
-      </w:pPr>
-      <w:r>
-        <w:rPr>
-          <w:rFonts w:ascii="Figtree" w:hAnsi="Figtree"/>
+      </w:pPr>
+      <w:r>
+        <w:rPr>
+          <w:rFonts w:ascii="Cambria" w:hAnsi="Cambria"/>
           <w:b/>
           <w:bCs/>
-          <w:sz w:val="25"/>
-          <w:szCs w:val="25"/>
+          <w:sz w:val="32"/>
+          <w:szCs w:val="32"/>
           <w:lang w:val="nb-NO"/>
         </w:rPr>
         <w:t xml:space="preserve"> </w:t>
       </w:r>
       <w:r>
         <w:rPr>
-          <w:rFonts w:ascii="Figtree" w:hAnsi="Figtree"/>
+          <w:rFonts w:ascii="Cambria" w:hAnsi="Cambria"/>
           <w:b/>
           <w:bCs/>
-          <w:sz w:val="25"/>
-          <w:szCs w:val="25"/>
+          <w:sz w:val="32"/>
+          <w:szCs w:val="32"/>
           <w:lang w:val="nb-NO"/>
         </w:rPr>
         <w:t xml:space="preserve"> </w:t>
       </w:r>
       <w:r>
         <w:rPr>
-          <w:rFonts w:ascii="Figtree" w:hAnsi="Figtree"/>
+          <w:rFonts w:ascii="Cambria" w:hAnsi="Cambria"/>
           <w:b/>
           <w:bCs/>
-          <w:sz w:val="25"/>
-          <w:szCs w:val="25"/>
+          <w:sz w:val="32"/>
+          <w:szCs w:val="32"/>
           <w:lang w:val="nb-NO"/>
         </w:rPr>
         <w:t>DIREKTORAT</w:t>
       </w:r>
       <w:r>
         <w:rPr>
-          <w:rFonts w:ascii="Figtree" w:hAnsi="Figtree"/>
+          <w:rFonts w:ascii="Cambria" w:hAnsi="Cambria"/>
           <w:b/>
           <w:bCs/>
-          <w:sz w:val="25"/>
-          <w:szCs w:val="25"/>
+          <w:spacing w:val="-10"/>
+          <w:sz w:val="32"/>
+          <w:szCs w:val="32"/>
           <w:lang w:val="nb-NO"/>
         </w:rPr>
         <w:t xml:space="preserve"> </w:t>
       </w:r>
       <w:r>
         <w:rPr>
-          <w:rFonts w:ascii="Figtree" w:hAnsi="Figtree"/>
+          <w:rFonts w:ascii="Cambria" w:hAnsi="Cambria"/>
           <w:b/>
           <w:bCs/>
-          <w:sz w:val="25"/>
-          <w:szCs w:val="25"/>
+          <w:sz w:val="32"/>
+          <w:szCs w:val="32"/>
           <w:lang w:val="nb-NO"/>
         </w:rPr>
         <w:t>PENGENDALIAN</w:t>
       </w:r>
       <w:r>
         <w:rPr>
-          <w:rFonts w:ascii="Figtree" w:hAnsi="Figtree"/>
+          <w:rFonts w:ascii="Cambria" w:hAnsi="Cambria"/>
           <w:b/>
           <w:bCs/>
-          <w:sz w:val="25"/>
-          <w:szCs w:val="25"/>
+          <w:spacing w:val="-8"/>
+          <w:sz w:val="32"/>
+          <w:szCs w:val="32"/>
           <w:lang w:val="nb-NO"/>
         </w:rPr>
         <w:t xml:space="preserve"> </w:t>
       </w:r>
       <w:r>
         <w:rPr>
-          <w:rFonts w:ascii="Figtree" w:hAnsi="Figtree"/>
+          <w:rFonts w:ascii="Cambria" w:hAnsi="Cambria"/>
           <w:b/>
           <w:bCs/>
-          <w:sz w:val="25"/>
-          <w:szCs w:val="25"/>
+          <w:sz w:val="32"/>
+          <w:szCs w:val="32"/>
           <w:lang w:val="nb-NO"/>
         </w:rPr>
         <w:t>PERHUTANAN</w:t>
       </w:r>
       <w:r>
         <w:rPr>
-          <w:rFonts w:ascii="Figtree" w:hAnsi="Figtree"/>
+          <w:rFonts w:ascii="Cambria" w:hAnsi="Cambria"/>
           <w:b/>
           <w:bCs/>
-          <w:sz w:val="25"/>
-          <w:szCs w:val="25"/>
+          <w:spacing w:val="-7"/>
+          <w:sz w:val="32"/>
+          <w:szCs w:val="32"/>
           <w:lang w:val="nb-NO"/>
         </w:rPr>
         <w:t xml:space="preserve"> </w:t>
       </w:r>
       <w:r>
         <w:rPr>
-          <w:rFonts w:ascii="Figtree" w:hAnsi="Figtree"/>
+          <w:rFonts w:ascii="Cambria" w:hAnsi="Cambria"/>
           <w:b/>
           <w:bCs/>
-          <w:sz w:val="25"/>
-          <w:szCs w:val="25"/>
+          <w:spacing w:val="-2"/>
+          <w:sz w:val="32"/>
+          <w:szCs w:val="32"/>
           <w:lang w:val="nb-NO"/>
         </w:rPr>
         <w:t>SOSIAL</w:t>
@@ -310,31 +314,31 @@
         <mc:AlternateContent>
           <mc:Choice Requires="wps">
             <w:drawing>
-              <wp:anchor distT="0" distB="0" distL="0" distR="0" simplePos="0" relativeHeight="251659264" behindDoc="0" locked="0" layoutInCell="1" allowOverlap="1" ns4:anchorId="33EC01D8" ns4:editId="0FC2FB41">
+              <wp:anchor distT="0" distB="0" distL="0" distR="0" simplePos="0" relativeHeight="251659264" behindDoc="0" locked="0" layoutInCell="1" allowOverlap="1" wp14:anchorId="33EC01D8" wp14:editId="0FC2FB41">
                 <wp:simplePos x="0" y="0"/>
                 <wp:positionH relativeFrom="page">
-                  <wp:posOffset>720000</wp:posOffset>
+                  <wp:posOffset>356235</wp:posOffset>
                 </wp:positionH>
                 <wp:positionV relativeFrom="page">
                   <wp:posOffset>1335405</wp:posOffset>
                 </wp:positionV>
-                <wp:extent cx="6120000" cy="57150"/>
+                <wp:extent cx="7127875" cy="57150"/>
                 <wp:effectExtent l="0" t="0" r="0" b="0"/>
                 <wp:wrapNone/>
                 <wp:docPr id="3" name="Graphic 3"/>
                 <wp:cNvGraphicFramePr>
-                  <a:graphicFrameLocks/>
+                  <a:graphicFrameLocks xmlns:a="http://schemas.openxmlformats.org/drawingml/2006/main"/>
                 </wp:cNvGraphicFramePr>
-                <a:graphic>
+                <a:graphic xmlns:a="http://schemas.openxmlformats.org/drawingml/2006/main">
                   <a:graphicData uri="http://schemas.microsoft.com/office/word/2010/wordprocessingShape">
-                    <ns8:wsp>
-                      <ns8:cNvSpPr>
+                    <wps:wsp>
+                      <wps:cNvSpPr>
                         <a:spLocks/>
-                      </ns8:cNvSpPr>
-                      <ns8:spPr>
+                      </wps:cNvSpPr>
+                      <wps:spPr>
                         <a:xfrm>
                           <a:off x="0" y="0"/>
-                          <a:ext cx="6120000" cy="57150"/>
+                          <a:ext cx="7127875" cy="57150"/>
                         </a:xfrm>
                         <a:custGeom>
                           <a:avLst/>
@@ -384,14 +388,14 @@
                         <a:solidFill>
                           <a:srgbClr val="000000"/>
                         </a:solidFill>
-                      </ns8:spPr>
-                      <ns8:bodyPr wrap="square" lIns="0" tIns="0" rIns="0" bIns="0" rtlCol="0">
+                      </wps:spPr>
+                      <wps:bodyPr wrap="square" lIns="0" tIns="0" rIns="0" bIns="0" rtlCol="0">
                         <a:prstTxWarp prst="textNoShape">
                           <a:avLst/>
                         </a:prstTxWarp>
                         <a:noAutofit/>
-                      </ns8:bodyPr>
-                    </ns8:wsp>
+                      </wps:bodyPr>
+                    </wps:wsp>
                   </a:graphicData>
                 </a:graphic>
               </wp:anchor>
@@ -399,7 +403,7 @@
           </mc:Choice>
           <mc:Fallback>
             <w:pict>
-              <v:shape w14:anchorId="6EA5F5A4" id="Graphic 3" o:spid="_x0000_s1026" style="position:absolute;margin-left:56.7pt;margin-top:12pt;width:481.9pt;height:4.5pt;z-index:251659264;visibility:visible;mso-wrap-style:square;mso-width-percent:0;mso-height-percent:0;mso-wrap-distance-left:9pt;mso-wrap-distance-top:0;mso-wrap-distance-right:9pt;mso-wrap-distance-bottom:0;mso-position-horizontal:absolute;mso-position-horizontal-relative:page;mso-position-vertical:absolute;mso-position-vertical-relative:paragraph;mso-width-percent:0;mso-height-percent:0;mso-width-relative:page;mso-height-relative:page;v-text-anchor:top" coordsize="7127875,57150" o:gfxdata="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" path="m7127875,45720l,45720,,57150r7127875,l7127875,45720xem7127875,l,,,34290r7127875,l7127875,xe" fillcolor="black" stroked="f">
+              <v:shape w14:anchorId="6EA5F5A4" id="Graphic 3" o:spid="_x0000_s1026" style="position:absolute;margin-left:28.05pt;margin-top:105.15pt;width:561.25pt;height:4.5pt;z-index:251659264;visibility:visible;mso-wrap-style:square;mso-wrap-distance-left:0;mso-wrap-distance-top:0;mso-wrap-distance-right:0;mso-wrap-distance-bottom:0;mso-position-horizontal:absolute;mso-position-horizontal-relative:page;mso-position-vertical:absolute;mso-position-vertical-relative:page;v-text-anchor:top" coordsize="7127875,57150" o:gfxdata="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" path="m7127875,45720l,45720,,57150r7127875,l7127875,45720xem7127875,l,,,34290r7127875,l7127875,xe" fillcolor="black" stroked="f">
                 <v:path arrowok="t"/>
                 <w10:wrap anchorx="page" anchory="page"/>
               </v:shape>
@@ -696,8 +700,8 @@
     <w:tbl>
       <w:tblPr>
         <w:tblStyle w:val="TableGrid"/>
-        <w:tblW w:w="9638" w:type="dxa"/>
-        <w:tblInd w:w="0" w:type="dxa"/>
+        <w:tblW w:w="9967" w:type="dxa"/>
+        <w:tblInd w:w="-540" w:type="dxa"/>
         <w:tblBorders>
           <w:top w:val="none" w:sz="0" w:space="0" w:color="auto"/>
           <w:left w:val="none" w:sz="0" w:space="0" w:color="auto"/>
@@ -709,8 +713,8 @@
         <w:tblLook w:val="04A0" w:firstRow="1" w:lastRow="0" w:firstColumn="1" w:lastColumn="0" w:noHBand="0" w:noVBand="1"/>
       </w:tblPr>
       <w:tblGrid>
-        <w:gridCol w:w="2000"/>
-        <w:gridCol w:w="7638"/>
+        <w:gridCol w:w="1816"/>
+        <w:gridCol w:w="8151"/>
       </w:tblGrid>
       <w:tr>
         <w:trPr>
@@ -718,7 +722,7 @@
         </w:trPr>
         <w:tc>
           <w:tcPr>
-            <w:tcW w:w="2000" w:type="dxa"/>
+            <w:tcW w:w="1816" w:type="dxa"/>
           </w:tcPr>
           <w:p>
             <w:pPr>
@@ -753,7 +757,7 @@
         </w:tc>
         <w:tc>
           <w:tcPr>
-            <w:tcW w:w="7638" w:type="dxa"/>
+            <w:tcW w:w="8151" w:type="dxa"/>
           </w:tcPr>
           <w:p>
             <w:pPr>
@@ -902,14 +906,14 @@
     </w:tbl>
     <w:tbl>
       <w:tblPr>
-        <w:tblW w:w="9638" w:type="dxa"/>
-        <w:tblInd w:w="0" w:type="dxa"/>
+        <w:tblW w:w="9859" w:type="dxa"/>
+        <w:tblInd w:w="-540" w:type="dxa"/>
         <w:tblLook w:val="04A0" w:firstRow="1" w:lastRow="0" w:firstColumn="1" w:lastColumn="0" w:noHBand="0" w:noVBand="1"/>
       </w:tblPr>
       <w:tblGrid>
-        <w:gridCol w:w="2000"/>
-        <w:gridCol w:w="5638"/>
-        <w:gridCol w:w="2000"/>
+        <w:gridCol w:w="1816"/>
+        <w:gridCol w:w="5781"/>
+        <w:gridCol w:w="2262"/>
       </w:tblGrid>
       <w:tr>
         <w:trPr>
@@ -917,7 +921,7 @@
         </w:trPr>
         <w:tc>
           <w:tcPr>
-            <w:tcW w:w="2000" w:type="dxa"/>
+            <w:tcW w:w="1816" w:type="dxa"/>
           </w:tcPr>
           <w:p>
             <w:pPr>
@@ -1064,7 +1068,7 @@
         </w:tc>
         <w:tc>
           <w:tcPr>
-            <w:tcW w:w="7638" w:type="dxa"/>
+            <w:tcW w:w="8043" w:type="dxa"/>
             <w:gridSpan w:val="2"/>
           </w:tcPr>
           <w:p>
@@ -1497,7 +1501,7 @@
         </w:trPr>
         <w:tc>
           <w:tcPr>
-            <w:tcW w:w="9638" w:type="dxa"/>
+            <w:tcW w:w="9854" w:type="dxa"/>
             <w:gridSpan w:val="3"/>
           </w:tcPr>
           <w:p>
@@ -1539,7 +1543,7 @@
         </w:trPr>
         <w:tc>
           <w:tcPr>
-            <w:tcW w:w="2000" w:type="dxa"/>
+            <w:tcW w:w="1816" w:type="dxa"/>
           </w:tcPr>
           <w:p>
             <w:pPr>
@@ -1561,13 +1565,13 @@
                 <w:szCs w:val="22"/>
                 <w:lang w:val="id-ID"/>
               </w:rPr>
-              <w:t>Kepada :</w:t>
+              <w:t>Kepada          :</w:t>
             </w:r>
           </w:p>
         </w:tc>
         <w:tc>
           <w:tcPr>
-            <w:tcW w:w="7638" w:type="dxa"/>
+            <w:tcW w:w="8043" w:type="dxa"/>
             <w:gridSpan w:val="2"/>
           </w:tcPr>
           <w:p>
@@ -1806,7 +1810,7 @@
         </w:trPr>
         <w:tc>
           <w:tcPr>
-            <w:tcW w:w="2000" w:type="dxa"/>
+            <w:tcW w:w="1816" w:type="dxa"/>
           </w:tcPr>
           <w:p>
             <w:pPr>
@@ -1825,7 +1829,7 @@
                 <w:szCs w:val="22"/>
                 <w:lang w:val="id-ID"/>
               </w:rPr>
-              <w:t xml:space="preserve">Untuk :</w:t>
+              <w:t xml:space="preserve">Untuk            :     </w:t>
             </w:r>
           </w:p>
           <w:p>
@@ -1892,7 +1896,7 @@
         </w:tc>
         <w:tc>
           <w:tcPr>
-            <w:tcW w:w="7638" w:type="dxa"/>
+            <w:tcW w:w="8043" w:type="dxa"/>
             <w:gridSpan w:val="2"/>
           </w:tcPr>
           <w:p>
@@ -2366,7 +2370,7 @@
         </w:trPr>
         <w:tc>
           <w:tcPr>
-            <w:tcW w:w="9638" w:type="dxa"/>
+            <w:tcW w:w="7597" w:type="dxa"/>
             <w:gridSpan w:val="2"/>
           </w:tcPr>
           <w:p>
@@ -2828,7 +2832,7 @@
     </w:p>
     <w:sectPr>
       <w:pgSz w:w="11906" w:h="16838"/>
-      <w:pgMar w:top="850" w:right="1134" w:bottom="1418" w:left="1134" w:header="706" w:footer="706" w:gutter="0"/>
+      <w:pgMar w:top="567" w:right="1440" w:bottom="360" w:left="1440" w:header="706" w:footer="706" w:gutter="0"/>
       <w:cols w:space="708"/>
       <w:docGrid w:linePitch="360"/>
     </w:sectPr>

</xml_diff>